<commit_message>
Modifica docx para incluir graficos!
</commit_message>
<xml_diff>
--- a/Proyecto_02_Limpieza_Datos/Documentacion_Proyecto_Limpieza.docx.docx
+++ b/Proyecto_02_Limpieza_Datos/Documentacion_Proyecto_Limpieza.docx.docx
@@ -1,13 +1,10 @@
 
 <file path=word/document.xml><?xml version="1.0" encoding="utf-8"?>
-<w:document xmlns:o="urn:schemas-microsoft-com:office:office" xmlns:r="http://schemas.openxmlformats.org/officeDocument/2006/relationships" xmlns:v="urn:schemas-microsoft-com:vml" xmlns:w="http://schemas.openxmlformats.org/wordprocessingml/2006/main" xmlns:w10="urn:schemas-microsoft-com:office:word" xmlns:wp="http://schemas.openxmlformats.org/drawingml/2006/wordprocessingDrawing" xmlns:wps="http://schemas.microsoft.com/office/word/2010/wordprocessingShape" xmlns:wpg="http://schemas.microsoft.com/office/word/2010/wordprocessingGroup" xmlns:mc="http://schemas.openxmlformats.org/markup-compatibility/2006" xmlns:wp14="http://schemas.microsoft.com/office/word/2010/wordprocessingDrawing" xmlns:w14="http://schemas.microsoft.com/office/word/2010/wordml" xmlns:w15="http://schemas.microsoft.com/office/word/2012/wordml" mc:Ignorable="w14 wp14 w15">
+<w:document xmlns:wpc="http://schemas.microsoft.com/office/word/2010/wordprocessingCanvas" xmlns:cx="http://schemas.microsoft.com/office/drawing/2014/chartex" xmlns:cx1="http://schemas.microsoft.com/office/drawing/2015/9/8/chartex" xmlns:cx2="http://schemas.microsoft.com/office/drawing/2015/10/21/chartex" xmlns:cx3="http://schemas.microsoft.com/office/drawing/2016/5/9/chartex" xmlns:cx4="http://schemas.microsoft.com/office/drawing/2016/5/10/chartex" xmlns:cx5="http://schemas.microsoft.com/office/drawing/2016/5/11/chartex" xmlns:cx6="http://schemas.microsoft.com/office/drawing/2016/5/12/chartex" xmlns:cx7="http://schemas.microsoft.com/office/drawing/2016/5/13/chartex" xmlns:cx8="http://schemas.microsoft.com/office/drawing/2016/5/14/chartex" xmlns:mc="http://schemas.openxmlformats.org/markup-compatibility/2006" xmlns:aink="http://schemas.microsoft.com/office/drawing/2016/ink" xmlns:am3d="http://schemas.microsoft.com/office/drawing/2017/model3d" xmlns:o="urn:schemas-microsoft-com:office:office" xmlns:oel="http://schemas.microsoft.com/office/2019/extlst" xmlns:r="http://schemas.openxmlformats.org/officeDocument/2006/relationships" xmlns:m="http://schemas.openxmlformats.org/officeDocument/2006/math" xmlns:v="urn:schemas-microsoft-com:vml" xmlns:wp14="http://schemas.microsoft.com/office/word/2010/wordprocessingDrawing" xmlns:wp="http://schemas.openxmlformats.org/drawingml/2006/wordprocessingDrawing" xmlns:w10="urn:schemas-microsoft-com:office:word" xmlns:w="http://schemas.openxmlformats.org/wordprocessingml/2006/main" xmlns:w14="http://schemas.microsoft.com/office/word/2010/wordml" xmlns:w15="http://schemas.microsoft.com/office/word/2012/wordml" xmlns:w16cex="http://schemas.microsoft.com/office/word/2018/wordml/cex" xmlns:w16cid="http://schemas.microsoft.com/office/word/2016/wordml/cid" xmlns:w16="http://schemas.microsoft.com/office/word/2018/wordml" xmlns:w16du="http://schemas.microsoft.com/office/word/2023/wordml/word16du" xmlns:w16sdtdh="http://schemas.microsoft.com/office/word/2020/wordml/sdtdatahash" xmlns:w16sdtfl="http://schemas.microsoft.com/office/word/2024/wordml/sdtformatlock" xmlns:w16se="http://schemas.microsoft.com/office/word/2015/wordml/symex" xmlns:wpg="http://schemas.microsoft.com/office/word/2010/wordprocessingGroup" xmlns:wpi="http://schemas.microsoft.com/office/word/2010/wordprocessingInk" xmlns:wne="http://schemas.microsoft.com/office/word/2006/wordml" xmlns:wps="http://schemas.microsoft.com/office/word/2010/wordprocessingShape" mc:Ignorable="w14 w15 w16se w16cid w16 w16cex w16sdtdh w16sdtfl w16du wp14">
   <w:body>
     <w:p>
       <w:pPr>
-        <w:pStyle w:val="Heading2"/>
-        <w:bidi w:val="0"/>
-        <w:spacing w:before="200" w:after="120"/>
-        <w:jc w:val="start"/>
+        <w:pStyle w:val="Ttulo2"/>
         <w:rPr>
           <w:rFonts w:ascii="Google Sans;sans-serif" w:hAnsi="Google Sans;sans-serif"/>
         </w:rPr>
@@ -21,11 +18,8 @@
     </w:p>
     <w:p>
       <w:pPr>
-        <w:pStyle w:val="Heading3"/>
-        <w:bidi w:val="0"/>
-        <w:spacing w:lineRule="auto" w:line="273" w:before="0" w:after="140"/>
-        <w:ind w:hanging="0" w:start="0" w:end="0"/>
-        <w:jc w:val="start"/>
+        <w:pStyle w:val="Ttulo3"/>
+        <w:spacing w:before="0" w:after="140" w:line="273" w:lineRule="auto"/>
         <w:rPr>
           <w:rFonts w:ascii="Google Sans;sans-serif" w:hAnsi="Google Sans;sans-serif"/>
         </w:rPr>
@@ -39,12 +33,8 @@
     </w:p>
     <w:p>
       <w:pPr>
-        <w:pStyle w:val="BodyText"/>
-        <w:pBdr/>
-        <w:bidi w:val="0"/>
-        <w:spacing w:lineRule="auto" w:line="273" w:before="0" w:after="140"/>
-        <w:ind w:hanging="0" w:start="0" w:end="0"/>
-        <w:jc w:val="start"/>
+        <w:pStyle w:val="Textoindependiente"/>
+        <w:spacing w:line="273" w:lineRule="auto"/>
         <w:rPr>
           <w:rFonts w:ascii="Google Sans Text;sans-serif" w:hAnsi="Google Sans Text;sans-serif"/>
         </w:rPr>
@@ -58,30 +48,37 @@
     </w:p>
     <w:p>
       <w:pPr>
-        <w:pStyle w:val="BodyText"/>
-        <w:pBdr/>
-        <w:bidi w:val="0"/>
-        <w:spacing w:lineRule="auto" w:line="273" w:before="0" w:after="140"/>
-        <w:ind w:hanging="0" w:start="0" w:end="0"/>
-        <w:jc w:val="start"/>
-        <w:rPr>
-          <w:rFonts w:ascii="Google Sans Text;sans-serif" w:hAnsi="Google Sans Text;sans-serif"/>
-        </w:rPr>
-      </w:pPr>
-      <w:r>
-        <w:rPr>
-          <w:rFonts w:ascii="Google Sans Text;sans-serif" w:hAnsi="Google Sans Text;sans-serif"/>
-        </w:rPr>
-        <w:t>Este proyecto se centró en la limpieza profunda y la estandarización de los datos de ventas de BiciGo, resolviendo problemas de inconsistencia y formato. Su objetivo final fue garantizar que la información fuera confiable y analizable, sentando las bases para futuros análisis de rentabilidad y expansión.</w:t>
+        <w:pStyle w:val="Textoindependiente"/>
+        <w:spacing w:line="273" w:lineRule="auto"/>
+        <w:rPr>
+          <w:rFonts w:ascii="Google Sans Text;sans-serif" w:hAnsi="Google Sans Text;sans-serif"/>
+        </w:rPr>
+      </w:pPr>
+      <w:r>
+        <w:rPr>
+          <w:rFonts w:ascii="Google Sans Text;sans-serif" w:hAnsi="Google Sans Text;sans-serif"/>
+        </w:rPr>
+        <w:t xml:space="preserve">Este proyecto se centró en la limpieza profunda y la estandarización de los datos de ventas de </w:t>
+      </w:r>
+      <w:proofErr w:type="spellStart"/>
+      <w:r>
+        <w:rPr>
+          <w:rFonts w:ascii="Google Sans Text;sans-serif" w:hAnsi="Google Sans Text;sans-serif"/>
+        </w:rPr>
+        <w:t>BiciGo</w:t>
+      </w:r>
+      <w:proofErr w:type="spellEnd"/>
+      <w:r>
+        <w:rPr>
+          <w:rFonts w:ascii="Google Sans Text;sans-serif" w:hAnsi="Google Sans Text;sans-serif"/>
+        </w:rPr>
+        <w:t>, resolviendo problemas de inconsistencia y formato. Su objetivo final fue garantizar que la información fuera confiable y analizable, sentando las bases para futuros análisis de rentabilidad y expansión.</w:t>
       </w:r>
     </w:p>
     <w:p>
       <w:pPr>
-        <w:pStyle w:val="Heading3"/>
-        <w:bidi w:val="0"/>
-        <w:spacing w:lineRule="auto" w:line="273" w:before="0" w:after="140"/>
-        <w:ind w:hanging="0" w:start="0" w:end="0"/>
-        <w:jc w:val="start"/>
+        <w:pStyle w:val="Ttulo3"/>
+        <w:spacing w:before="0" w:after="140" w:line="273" w:lineRule="auto"/>
         <w:rPr>
           <w:rFonts w:ascii="Google Sans;sans-serif" w:hAnsi="Google Sans;sans-serif"/>
         </w:rPr>
@@ -95,20 +92,15 @@
     </w:p>
     <w:p>
       <w:pPr>
-        <w:pStyle w:val="BodyText"/>
+        <w:pStyle w:val="Textoindependiente"/>
         <w:numPr>
           <w:ilvl w:val="0"/>
           <w:numId w:val="1"/>
         </w:numPr>
-        <w:pBdr/>
-        <w:tabs>
-          <w:tab w:val="clear" w:pos="709"/>
-          <w:tab w:val="left" w:pos="709" w:leader="none"/>
-        </w:tabs>
-        <w:bidi w:val="0"/>
-        <w:spacing w:lineRule="auto" w:line="273" w:before="0" w:after="140"/>
-        <w:ind w:hanging="283" w:start="709" w:end="0"/>
-        <w:jc w:val="start"/>
+        <w:tabs>
+          <w:tab w:val="left" w:pos="709"/>
+        </w:tabs>
+        <w:spacing w:line="273" w:lineRule="auto"/>
         <w:rPr>
           <w:rFonts w:ascii="Google Sans Text;sans-serif" w:hAnsi="Google Sans Text;sans-serif"/>
         </w:rPr>
@@ -124,25 +116,34 @@
         <w:rPr>
           <w:rFonts w:ascii="Google Sans Text;sans-serif" w:hAnsi="Google Sans Text;sans-serif"/>
         </w:rPr>
-        <w:t xml:space="preserve"> Los registros de ventas de BiciGo presentaban graves inconsistencias (errores de escritura, formatos mixtos, datos combinados en una sola columna y valores faltantes). Esto hacía que cualquier intento de análisis (ej. contar ventas totales o segmentar por producto) resultara erróneo, llevando a la gerencia a conclusiones sesgadas.</w:t>
+        <w:t xml:space="preserve"> Los registros de ventas de </w:t>
+      </w:r>
+      <w:proofErr w:type="spellStart"/>
+      <w:r>
+        <w:rPr>
+          <w:rFonts w:ascii="Google Sans Text;sans-serif" w:hAnsi="Google Sans Text;sans-serif"/>
+        </w:rPr>
+        <w:t>BiciGo</w:t>
+      </w:r>
+      <w:proofErr w:type="spellEnd"/>
+      <w:r>
+        <w:rPr>
+          <w:rFonts w:ascii="Google Sans Text;sans-serif" w:hAnsi="Google Sans Text;sans-serif"/>
+        </w:rPr>
+        <w:t xml:space="preserve"> presentaban graves inconsistencias (errores de escritura, formatos mixtos, datos combinados en una sola columna y valores faltantes). Esto hacía que cualquier intento de análisis (ej. contar ventas totales o segmentar por producto) resultara erróneo, llevando a la gerencia a conclusiones sesgadas.</w:t>
       </w:r>
     </w:p>
     <w:p>
       <w:pPr>
-        <w:pStyle w:val="BodyText"/>
+        <w:pStyle w:val="Textoindependiente"/>
         <w:numPr>
           <w:ilvl w:val="0"/>
           <w:numId w:val="1"/>
         </w:numPr>
-        <w:pBdr/>
-        <w:tabs>
-          <w:tab w:val="clear" w:pos="709"/>
-          <w:tab w:val="left" w:pos="709" w:leader="none"/>
-        </w:tabs>
-        <w:bidi w:val="0"/>
-        <w:spacing w:lineRule="auto" w:line="273" w:before="0" w:after="140"/>
-        <w:ind w:hanging="283" w:start="709" w:end="0"/>
-        <w:jc w:val="start"/>
+        <w:tabs>
+          <w:tab w:val="left" w:pos="709"/>
+        </w:tabs>
+        <w:spacing w:line="273" w:lineRule="auto"/>
         <w:rPr>
           <w:rFonts w:ascii="Google Sans Text;sans-serif" w:hAnsi="Google Sans Text;sans-serif"/>
           <w:b/>
@@ -158,21 +159,15 @@
     </w:p>
     <w:p>
       <w:pPr>
-        <w:pStyle w:val="BodyText"/>
+        <w:pStyle w:val="Textoindependiente"/>
         <w:numPr>
           <w:ilvl w:val="1"/>
           <w:numId w:val="1"/>
         </w:numPr>
-        <w:pBdr/>
-        <w:tabs>
-          <w:tab w:val="clear" w:pos="709"/>
-          <w:tab w:val="left" w:pos="1418" w:leader="none"/>
-        </w:tabs>
-        <w:bidi w:val="0"/>
-        <w:spacing w:lineRule="auto" w:line="273" w:before="0" w:after="140"/>
-        <w:ind w:hanging="283" w:start="1418" w:end="0"/>
-        <w:jc w:val="start"/>
-        <w:rPr/>
+        <w:tabs>
+          <w:tab w:val="left" w:pos="1418"/>
+        </w:tabs>
+        <w:spacing w:line="273" w:lineRule="auto"/>
       </w:pPr>
       <w:r>
         <w:rPr>
@@ -180,6 +175,7 @@
         </w:rPr>
         <w:t xml:space="preserve">Estandarizar los formatos de texto (ej. mayúsculas/minúsculas, </w:t>
       </w:r>
+      <w:proofErr w:type="spellStart"/>
       <w:r>
         <w:rPr>
           <w:rStyle w:val="Textooriginal"/>
@@ -187,6 +183,7 @@
         </w:rPr>
         <w:t>Estado_Pago</w:t>
       </w:r>
+      <w:proofErr w:type="spellEnd"/>
       <w:r>
         <w:rPr>
           <w:rFonts w:ascii="Google Sans Text;sans-serif" w:hAnsi="Google Sans Text;sans-serif"/>
@@ -196,21 +193,15 @@
     </w:p>
     <w:p>
       <w:pPr>
-        <w:pStyle w:val="BodyText"/>
+        <w:pStyle w:val="Textoindependiente"/>
         <w:numPr>
           <w:ilvl w:val="1"/>
           <w:numId w:val="1"/>
         </w:numPr>
-        <w:pBdr/>
-        <w:tabs>
-          <w:tab w:val="clear" w:pos="709"/>
-          <w:tab w:val="left" w:pos="1418" w:leader="none"/>
-        </w:tabs>
-        <w:bidi w:val="0"/>
-        <w:spacing w:lineRule="auto" w:line="273" w:before="0" w:after="140"/>
-        <w:ind w:hanging="283" w:start="1418" w:end="0"/>
-        <w:jc w:val="start"/>
-        <w:rPr/>
+        <w:tabs>
+          <w:tab w:val="left" w:pos="1418"/>
+        </w:tabs>
+        <w:spacing w:line="273" w:lineRule="auto"/>
       </w:pPr>
       <w:r>
         <w:rPr>
@@ -218,6 +209,7 @@
         </w:rPr>
         <w:t>Dividir información compleja combinada en una sola columna (</w:t>
       </w:r>
+      <w:proofErr w:type="spellStart"/>
       <w:r>
         <w:rPr>
           <w:rStyle w:val="Textooriginal"/>
@@ -225,6 +217,7 @@
         </w:rPr>
         <w:t>Datos_Venta</w:t>
       </w:r>
+      <w:proofErr w:type="spellEnd"/>
       <w:r>
         <w:rPr>
           <w:rFonts w:ascii="Google Sans Text;sans-serif" w:hAnsi="Google Sans Text;sans-serif"/>
@@ -234,20 +227,15 @@
     </w:p>
     <w:p>
       <w:pPr>
-        <w:pStyle w:val="BodyText"/>
+        <w:pStyle w:val="Textoindependiente"/>
         <w:numPr>
           <w:ilvl w:val="1"/>
           <w:numId w:val="1"/>
         </w:numPr>
-        <w:pBdr/>
-        <w:tabs>
-          <w:tab w:val="clear" w:pos="709"/>
-          <w:tab w:val="left" w:pos="1418" w:leader="none"/>
-        </w:tabs>
-        <w:bidi w:val="0"/>
-        <w:spacing w:lineRule="auto" w:line="273" w:before="0" w:after="140"/>
-        <w:ind w:hanging="283" w:start="1418" w:end="0"/>
-        <w:jc w:val="start"/>
+        <w:tabs>
+          <w:tab w:val="left" w:pos="1418"/>
+        </w:tabs>
+        <w:spacing w:line="273" w:lineRule="auto"/>
         <w:rPr>
           <w:rFonts w:ascii="Google Sans Text;sans-serif" w:hAnsi="Google Sans Text;sans-serif"/>
         </w:rPr>
@@ -261,20 +249,15 @@
     </w:p>
     <w:p>
       <w:pPr>
-        <w:pStyle w:val="BodyText"/>
+        <w:pStyle w:val="Textoindependiente"/>
         <w:numPr>
           <w:ilvl w:val="1"/>
           <w:numId w:val="1"/>
         </w:numPr>
-        <w:pBdr/>
-        <w:tabs>
-          <w:tab w:val="clear" w:pos="709"/>
-          <w:tab w:val="left" w:pos="1418" w:leader="none"/>
-        </w:tabs>
-        <w:bidi w:val="0"/>
-        <w:spacing w:lineRule="auto" w:line="273" w:before="0" w:after="140"/>
-        <w:ind w:hanging="283" w:start="1418" w:end="0"/>
-        <w:jc w:val="start"/>
+        <w:tabs>
+          <w:tab w:val="left" w:pos="1418"/>
+        </w:tabs>
+        <w:spacing w:line="273" w:lineRule="auto"/>
         <w:rPr>
           <w:rFonts w:ascii="Google Sans Text;sans-serif" w:hAnsi="Google Sans Text;sans-serif"/>
         </w:rPr>
@@ -288,11 +271,8 @@
     </w:p>
     <w:p>
       <w:pPr>
-        <w:pStyle w:val="Heading3"/>
-        <w:bidi w:val="0"/>
-        <w:spacing w:lineRule="auto" w:line="273" w:before="0" w:after="140"/>
-        <w:ind w:hanging="0" w:start="0" w:end="0"/>
-        <w:jc w:val="start"/>
+        <w:pStyle w:val="Ttulo3"/>
+        <w:spacing w:before="0" w:after="140" w:line="273" w:lineRule="auto"/>
         <w:rPr>
           <w:rFonts w:ascii="Google Sans;sans-serif" w:hAnsi="Google Sans;sans-serif"/>
         </w:rPr>
@@ -306,21 +286,15 @@
     </w:p>
     <w:p>
       <w:pPr>
-        <w:pStyle w:val="BodyText"/>
+        <w:pStyle w:val="Textoindependiente"/>
         <w:numPr>
           <w:ilvl w:val="0"/>
           <w:numId w:val="2"/>
         </w:numPr>
-        <w:pBdr/>
-        <w:tabs>
-          <w:tab w:val="clear" w:pos="709"/>
-          <w:tab w:val="left" w:pos="709" w:leader="none"/>
-        </w:tabs>
-        <w:bidi w:val="0"/>
-        <w:spacing w:lineRule="auto" w:line="273" w:before="0" w:after="140"/>
-        <w:ind w:hanging="283" w:start="709" w:end="0"/>
-        <w:jc w:val="start"/>
-        <w:rPr/>
+        <w:tabs>
+          <w:tab w:val="left" w:pos="709"/>
+        </w:tabs>
+        <w:spacing w:line="273" w:lineRule="auto"/>
       </w:pPr>
       <w:r>
         <w:rPr>
@@ -351,20 +325,15 @@
     </w:p>
     <w:p>
       <w:pPr>
-        <w:pStyle w:val="BodyText"/>
+        <w:pStyle w:val="Textoindependiente"/>
         <w:numPr>
           <w:ilvl w:val="0"/>
           <w:numId w:val="2"/>
         </w:numPr>
-        <w:pBdr/>
-        <w:tabs>
-          <w:tab w:val="clear" w:pos="709"/>
-          <w:tab w:val="left" w:pos="709" w:leader="none"/>
-        </w:tabs>
-        <w:bidi w:val="0"/>
-        <w:spacing w:lineRule="auto" w:line="273" w:before="0" w:after="140"/>
-        <w:ind w:hanging="283" w:start="709" w:end="0"/>
-        <w:jc w:val="start"/>
+        <w:tabs>
+          <w:tab w:val="left" w:pos="709"/>
+        </w:tabs>
+        <w:spacing w:line="273" w:lineRule="auto"/>
         <w:rPr>
           <w:rFonts w:ascii="Google Sans Text;sans-serif" w:hAnsi="Google Sans Text;sans-serif"/>
         </w:rPr>
@@ -380,25 +349,34 @@
         <w:rPr>
           <w:rFonts w:ascii="Google Sans Text;sans-serif" w:hAnsi="Google Sans Text;sans-serif"/>
         </w:rPr>
-        <w:t xml:space="preserve"> Registros internos de transacciones de ventas y pagos de BiciGo.</w:t>
+        <w:t xml:space="preserve"> Registros internos de transacciones de ventas y pagos de </w:t>
+      </w:r>
+      <w:proofErr w:type="spellStart"/>
+      <w:r>
+        <w:rPr>
+          <w:rFonts w:ascii="Google Sans Text;sans-serif" w:hAnsi="Google Sans Text;sans-serif"/>
+        </w:rPr>
+        <w:t>BiciGo</w:t>
+      </w:r>
+      <w:proofErr w:type="spellEnd"/>
+      <w:r>
+        <w:rPr>
+          <w:rFonts w:ascii="Google Sans Text;sans-serif" w:hAnsi="Google Sans Text;sans-serif"/>
+        </w:rPr>
+        <w:t>.</w:t>
       </w:r>
     </w:p>
     <w:p>
       <w:pPr>
-        <w:pStyle w:val="BodyText"/>
+        <w:pStyle w:val="Textoindependiente"/>
         <w:numPr>
           <w:ilvl w:val="0"/>
           <w:numId w:val="2"/>
         </w:numPr>
-        <w:pBdr/>
-        <w:tabs>
-          <w:tab w:val="clear" w:pos="709"/>
-          <w:tab w:val="left" w:pos="709" w:leader="none"/>
-        </w:tabs>
-        <w:bidi w:val="0"/>
-        <w:spacing w:lineRule="auto" w:line="273" w:before="0" w:after="140"/>
-        <w:ind w:hanging="283" w:start="709" w:end="0"/>
-        <w:jc w:val="start"/>
+        <w:tabs>
+          <w:tab w:val="left" w:pos="709"/>
+        </w:tabs>
+        <w:spacing w:line="273" w:lineRule="auto"/>
         <w:rPr>
           <w:rFonts w:ascii="Google Sans Text;sans-serif" w:hAnsi="Google Sans Text;sans-serif"/>
           <w:b/>
@@ -414,22 +392,17 @@
     </w:p>
     <w:p>
       <w:pPr>
-        <w:pStyle w:val="BodyText"/>
+        <w:pStyle w:val="Textoindependiente"/>
         <w:numPr>
           <w:ilvl w:val="1"/>
           <w:numId w:val="2"/>
         </w:numPr>
-        <w:pBdr/>
-        <w:tabs>
-          <w:tab w:val="clear" w:pos="709"/>
-          <w:tab w:val="left" w:pos="1418" w:leader="none"/>
-        </w:tabs>
-        <w:bidi w:val="0"/>
-        <w:spacing w:lineRule="auto" w:line="273" w:before="0" w:after="140"/>
-        <w:ind w:hanging="283" w:start="1418" w:end="0"/>
-        <w:jc w:val="start"/>
-        <w:rPr/>
-      </w:pPr>
+        <w:tabs>
+          <w:tab w:val="left" w:pos="1418"/>
+        </w:tabs>
+        <w:spacing w:line="273" w:lineRule="auto"/>
+      </w:pPr>
+      <w:proofErr w:type="spellStart"/>
       <w:r>
         <w:rPr>
           <w:rStyle w:val="Textooriginal"/>
@@ -437,11 +410,26 @@
         </w:rPr>
         <w:t>Datos_Venta</w:t>
       </w:r>
-      <w:r>
-        <w:rPr>
-          <w:rFonts w:ascii="Google Sans Text;sans-serif" w:hAnsi="Google Sans Text;sans-serif"/>
-        </w:rPr>
-        <w:t>: Contenía Nombre, Categoría y ID del producto en una sola celda, separados por punto y coma (</w:t>
+      <w:proofErr w:type="spellEnd"/>
+      <w:r>
+        <w:rPr>
+          <w:rFonts w:ascii="Google Sans Text;sans-serif" w:hAnsi="Google Sans Text;sans-serif"/>
+        </w:rPr>
+        <w:t xml:space="preserve">: Contenía Nombre, Categoría </w:t>
+      </w:r>
+      <w:proofErr w:type="spellStart"/>
+      <w:r>
+        <w:rPr>
+          <w:rFonts w:ascii="Google Sans Text;sans-serif" w:hAnsi="Google Sans Text;sans-serif"/>
+        </w:rPr>
+        <w:t>y</w:t>
+      </w:r>
+      <w:proofErr w:type="spellEnd"/>
+      <w:r>
+        <w:rPr>
+          <w:rFonts w:ascii="Google Sans Text;sans-serif" w:hAnsi="Google Sans Text;sans-serif"/>
+        </w:rPr>
+        <w:t xml:space="preserve"> ID del producto en una sola celda, separados por punto y coma (</w:t>
       </w:r>
       <w:r>
         <w:rPr>
@@ -466,22 +454,17 @@
     </w:p>
     <w:p>
       <w:pPr>
-        <w:pStyle w:val="BodyText"/>
+        <w:pStyle w:val="Textoindependiente"/>
         <w:numPr>
           <w:ilvl w:val="1"/>
           <w:numId w:val="2"/>
         </w:numPr>
-        <w:pBdr/>
-        <w:tabs>
-          <w:tab w:val="clear" w:pos="709"/>
-          <w:tab w:val="left" w:pos="1418" w:leader="none"/>
-        </w:tabs>
-        <w:bidi w:val="0"/>
-        <w:spacing w:lineRule="auto" w:line="273" w:before="0" w:after="140"/>
-        <w:ind w:hanging="283" w:start="1418" w:end="0"/>
-        <w:jc w:val="start"/>
-        <w:rPr/>
-      </w:pPr>
+        <w:tabs>
+          <w:tab w:val="left" w:pos="1418"/>
+        </w:tabs>
+        <w:spacing w:line="273" w:lineRule="auto"/>
+      </w:pPr>
+      <w:proofErr w:type="spellStart"/>
       <w:r>
         <w:rPr>
           <w:rStyle w:val="Textooriginal"/>
@@ -489,11 +472,68 @@
         </w:rPr>
         <w:t>Fecha_Hora</w:t>
       </w:r>
-      <w:r>
-        <w:rPr>
-          <w:rFonts w:ascii="Google Sans Text;sans-serif" w:hAnsi="Google Sans Text;sans-serif"/>
-        </w:rPr>
-        <w:t xml:space="preserve">: Tenía formatos mixtos (dd/mm/aaaa, yyyy-mm-dd). </w:t>
+      <w:proofErr w:type="spellEnd"/>
+      <w:r>
+        <w:rPr>
+          <w:rFonts w:ascii="Google Sans Text;sans-serif" w:hAnsi="Google Sans Text;sans-serif"/>
+        </w:rPr>
+        <w:t>: Tenía formatos mixtos (</w:t>
+      </w:r>
+      <w:proofErr w:type="spellStart"/>
+      <w:r>
+        <w:rPr>
+          <w:rFonts w:ascii="Google Sans Text;sans-serif" w:hAnsi="Google Sans Text;sans-serif"/>
+        </w:rPr>
+        <w:t>dd</w:t>
+      </w:r>
+      <w:proofErr w:type="spellEnd"/>
+      <w:r>
+        <w:rPr>
+          <w:rFonts w:ascii="Google Sans Text;sans-serif" w:hAnsi="Google Sans Text;sans-serif"/>
+        </w:rPr>
+        <w:t>/mm/</w:t>
+      </w:r>
+      <w:proofErr w:type="spellStart"/>
+      <w:r>
+        <w:rPr>
+          <w:rFonts w:ascii="Google Sans Text;sans-serif" w:hAnsi="Google Sans Text;sans-serif"/>
+        </w:rPr>
+        <w:t>aaaa</w:t>
+      </w:r>
+      <w:proofErr w:type="spellEnd"/>
+      <w:r>
+        <w:rPr>
+          <w:rFonts w:ascii="Google Sans Text;sans-serif" w:hAnsi="Google Sans Text;sans-serif"/>
+        </w:rPr>
+        <w:t xml:space="preserve">, </w:t>
+      </w:r>
+      <w:proofErr w:type="spellStart"/>
+      <w:r>
+        <w:rPr>
+          <w:rFonts w:ascii="Google Sans Text;sans-serif" w:hAnsi="Google Sans Text;sans-serif"/>
+        </w:rPr>
+        <w:t>yyyy</w:t>
+      </w:r>
+      <w:proofErr w:type="spellEnd"/>
+      <w:r>
+        <w:rPr>
+          <w:rFonts w:ascii="Google Sans Text;sans-serif" w:hAnsi="Google Sans Text;sans-serif"/>
+        </w:rPr>
+        <w:t>-mm-</w:t>
+      </w:r>
+      <w:proofErr w:type="spellStart"/>
+      <w:r>
+        <w:rPr>
+          <w:rFonts w:ascii="Google Sans Text;sans-serif" w:hAnsi="Google Sans Text;sans-serif"/>
+        </w:rPr>
+        <w:t>dd</w:t>
+      </w:r>
+      <w:proofErr w:type="spellEnd"/>
+      <w:r>
+        <w:rPr>
+          <w:rFonts w:ascii="Google Sans Text;sans-serif" w:hAnsi="Google Sans Text;sans-serif"/>
+        </w:rPr>
+        <w:t xml:space="preserve">). </w:t>
       </w:r>
       <w:r>
         <w:rPr>
@@ -505,21 +545,15 @@
     </w:p>
     <w:p>
       <w:pPr>
-        <w:pStyle w:val="BodyText"/>
+        <w:pStyle w:val="Textoindependiente"/>
         <w:numPr>
           <w:ilvl w:val="1"/>
           <w:numId w:val="2"/>
         </w:numPr>
-        <w:pBdr/>
-        <w:tabs>
-          <w:tab w:val="clear" w:pos="709"/>
-          <w:tab w:val="left" w:pos="1418" w:leader="none"/>
-        </w:tabs>
-        <w:bidi w:val="0"/>
-        <w:spacing w:lineRule="auto" w:line="273" w:before="0" w:after="140"/>
-        <w:ind w:hanging="283" w:start="1418" w:end="0"/>
-        <w:jc w:val="start"/>
-        <w:rPr/>
+        <w:tabs>
+          <w:tab w:val="left" w:pos="1418"/>
+        </w:tabs>
+        <w:spacing w:line="273" w:lineRule="auto"/>
       </w:pPr>
       <w:r>
         <w:rPr>
@@ -557,22 +591,17 @@
     </w:p>
     <w:p>
       <w:pPr>
-        <w:pStyle w:val="BodyText"/>
+        <w:pStyle w:val="Textoindependiente"/>
         <w:numPr>
           <w:ilvl w:val="1"/>
           <w:numId w:val="2"/>
         </w:numPr>
-        <w:pBdr/>
-        <w:tabs>
-          <w:tab w:val="clear" w:pos="709"/>
-          <w:tab w:val="left" w:pos="1418" w:leader="none"/>
-        </w:tabs>
-        <w:bidi w:val="0"/>
-        <w:spacing w:lineRule="auto" w:line="273" w:before="0" w:after="140"/>
-        <w:ind w:hanging="283" w:start="1418" w:end="0"/>
-        <w:jc w:val="start"/>
-        <w:rPr/>
-      </w:pPr>
+        <w:tabs>
+          <w:tab w:val="left" w:pos="1418"/>
+        </w:tabs>
+        <w:spacing w:line="273" w:lineRule="auto"/>
+      </w:pPr>
+      <w:proofErr w:type="spellStart"/>
       <w:r>
         <w:rPr>
           <w:rStyle w:val="Textooriginal"/>
@@ -580,6 +609,7 @@
         </w:rPr>
         <w:t>Estado_Pago</w:t>
       </w:r>
+      <w:proofErr w:type="spellEnd"/>
       <w:r>
         <w:rPr>
           <w:rFonts w:ascii="Google Sans Text;sans-serif" w:hAnsi="Google Sans Text;sans-serif"/>
@@ -596,11 +626,8 @@
     </w:p>
     <w:p>
       <w:pPr>
-        <w:pStyle w:val="Heading3"/>
-        <w:bidi w:val="0"/>
-        <w:spacing w:lineRule="auto" w:line="273" w:before="0" w:after="140"/>
-        <w:ind w:hanging="0" w:start="0" w:end="0"/>
-        <w:jc w:val="start"/>
+        <w:pStyle w:val="Ttulo3"/>
+        <w:spacing w:before="0" w:after="140" w:line="273" w:lineRule="auto"/>
         <w:rPr>
           <w:rFonts w:ascii="Google Sans;sans-serif" w:hAnsi="Google Sans;sans-serif"/>
         </w:rPr>
@@ -614,11 +641,8 @@
     </w:p>
     <w:p>
       <w:pPr>
-        <w:pStyle w:val="BodyText"/>
-        <w:bidi w:val="0"/>
-        <w:spacing w:lineRule="auto" w:line="273" w:before="0" w:after="140"/>
-        <w:ind w:hanging="0" w:start="0" w:end="0"/>
-        <w:jc w:val="start"/>
+        <w:pStyle w:val="Textoindependiente"/>
+        <w:spacing w:line="273" w:lineRule="auto"/>
         <w:rPr>
           <w:rFonts w:ascii="Google Sans Text;sans-serif" w:hAnsi="Google Sans Text;sans-serif"/>
         </w:rPr>
@@ -659,15 +683,14 @@
     <w:tbl>
       <w:tblPr>
         <w:tblW w:w="9972" w:type="dxa"/>
-        <w:jc w:val="start"/>
-        <w:tblInd w:w="0" w:type="dxa"/>
         <w:tblLayout w:type="fixed"/>
         <w:tblCellMar>
           <w:top w:w="28" w:type="dxa"/>
-          <w:start w:w="28" w:type="dxa"/>
+          <w:left w:w="28" w:type="dxa"/>
           <w:bottom w:w="28" w:type="dxa"/>
-          <w:end w:w="28" w:type="dxa"/>
+          <w:right w:w="28" w:type="dxa"/>
         </w:tblCellMar>
+        <w:tblLook w:val="0000" w:firstRow="0" w:lastRow="0" w:firstColumn="0" w:lastColumn="0" w:noHBand="0" w:noVBand="0"/>
       </w:tblPr>
       <w:tblGrid>
         <w:gridCol w:w="2448"/>
@@ -676,31 +699,27 @@
       </w:tblGrid>
       <w:tr>
         <w:trPr>
-          <w:tblHeader w:val="true"/>
+          <w:tblHeader/>
         </w:trPr>
         <w:tc>
           <w:tcPr>
             <w:tcW w:w="2448" w:type="dxa"/>
             <w:tcBorders>
               <w:top w:val="single" w:sz="2" w:space="0" w:color="000000"/>
-              <w:start w:val="single" w:sz="2" w:space="0" w:color="000000"/>
+              <w:left w:val="single" w:sz="2" w:space="0" w:color="000000"/>
               <w:bottom w:val="single" w:sz="2" w:space="0" w:color="000000"/>
-              <w:end w:val="single" w:sz="2" w:space="0" w:color="000000"/>
+              <w:right w:val="single" w:sz="2" w:space="0" w:color="000000"/>
             </w:tcBorders>
             <w:vAlign w:val="center"/>
           </w:tcPr>
           <w:p>
             <w:pPr>
               <w:pStyle w:val="Contenidodelatabla"/>
-              <w:bidi w:val="0"/>
-              <w:spacing w:lineRule="auto" w:line="273" w:before="0" w:after="0"/>
-              <w:ind w:hanging="0" w:start="0" w:end="0"/>
-              <w:jc w:val="start"/>
-              <w:rPr/>
+              <w:spacing w:line="273" w:lineRule="auto"/>
             </w:pPr>
             <w:r>
               <w:rPr>
-                <w:rStyle w:val="Strong"/>
+                <w:rStyle w:val="Fuerte"/>
                 <w:rFonts w:ascii="Google Sans Text;sans-serif" w:hAnsi="Google Sans Text;sans-serif"/>
               </w:rPr>
               <w:t>Etapa</w:t>
@@ -712,24 +731,20 @@
             <w:tcW w:w="5496" w:type="dxa"/>
             <w:tcBorders>
               <w:top w:val="single" w:sz="2" w:space="0" w:color="000000"/>
-              <w:start w:val="single" w:sz="2" w:space="0" w:color="000000"/>
+              <w:left w:val="single" w:sz="2" w:space="0" w:color="000000"/>
               <w:bottom w:val="single" w:sz="2" w:space="0" w:color="000000"/>
-              <w:end w:val="single" w:sz="2" w:space="0" w:color="000000"/>
+              <w:right w:val="single" w:sz="2" w:space="0" w:color="000000"/>
             </w:tcBorders>
             <w:vAlign w:val="center"/>
           </w:tcPr>
           <w:p>
             <w:pPr>
               <w:pStyle w:val="Contenidodelatabla"/>
-              <w:bidi w:val="0"/>
-              <w:spacing w:lineRule="auto" w:line="273" w:before="0" w:after="0"/>
-              <w:ind w:hanging="0" w:start="0" w:end="0"/>
-              <w:jc w:val="start"/>
-              <w:rPr/>
+              <w:spacing w:line="273" w:lineRule="auto"/>
             </w:pPr>
             <w:r>
               <w:rPr>
-                <w:rStyle w:val="Strong"/>
+                <w:rStyle w:val="Fuerte"/>
                 <w:rFonts w:ascii="Google Sans Text;sans-serif" w:hAnsi="Google Sans Text;sans-serif"/>
               </w:rPr>
               <w:t>Proceso Detallado</w:t>
@@ -741,24 +756,20 @@
             <w:tcW w:w="2028" w:type="dxa"/>
             <w:tcBorders>
               <w:top w:val="single" w:sz="2" w:space="0" w:color="000000"/>
-              <w:start w:val="single" w:sz="2" w:space="0" w:color="000000"/>
+              <w:left w:val="single" w:sz="2" w:space="0" w:color="000000"/>
               <w:bottom w:val="single" w:sz="2" w:space="0" w:color="000000"/>
-              <w:end w:val="single" w:sz="2" w:space="0" w:color="000000"/>
+              <w:right w:val="single" w:sz="2" w:space="0" w:color="000000"/>
             </w:tcBorders>
             <w:vAlign w:val="center"/>
           </w:tcPr>
           <w:p>
             <w:pPr>
               <w:pStyle w:val="Contenidodelatabla"/>
-              <w:bidi w:val="0"/>
-              <w:spacing w:lineRule="auto" w:line="273" w:before="0" w:after="0"/>
-              <w:ind w:hanging="0" w:start="0" w:end="0"/>
-              <w:jc w:val="start"/>
-              <w:rPr/>
+              <w:spacing w:line="273" w:lineRule="auto"/>
             </w:pPr>
             <w:r>
               <w:rPr>
-                <w:rStyle w:val="Strong"/>
+                <w:rStyle w:val="Fuerte"/>
                 <w:rFonts w:ascii="Google Sans Text;sans-serif" w:hAnsi="Google Sans Text;sans-serif"/>
               </w:rPr>
               <w:t>Herramienta de Excel</w:t>
@@ -767,25 +778,21 @@
         </w:tc>
       </w:tr>
       <w:tr>
-        <w:trPr/>
         <w:tc>
           <w:tcPr>
             <w:tcW w:w="2448" w:type="dxa"/>
             <w:tcBorders>
               <w:top w:val="single" w:sz="2" w:space="0" w:color="000000"/>
-              <w:start w:val="single" w:sz="2" w:space="0" w:color="000000"/>
+              <w:left w:val="single" w:sz="2" w:space="0" w:color="000000"/>
               <w:bottom w:val="single" w:sz="2" w:space="0" w:color="000000"/>
-              <w:end w:val="single" w:sz="2" w:space="0" w:color="000000"/>
+              <w:right w:val="single" w:sz="2" w:space="0" w:color="000000"/>
             </w:tcBorders>
             <w:vAlign w:val="center"/>
           </w:tcPr>
           <w:p>
             <w:pPr>
               <w:pStyle w:val="Contenidodelatabla"/>
-              <w:bidi w:val="0"/>
-              <w:spacing w:lineRule="auto" w:line="273" w:before="0" w:after="140"/>
-              <w:ind w:hanging="0" w:start="0" w:end="0"/>
-              <w:jc w:val="start"/>
+              <w:spacing w:after="140" w:line="273" w:lineRule="auto"/>
               <w:rPr>
                 <w:rFonts w:ascii="Google Sans Text;sans-serif" w:hAnsi="Google Sans Text;sans-serif"/>
                 <w:b/>
@@ -805,20 +812,16 @@
             <w:tcW w:w="5496" w:type="dxa"/>
             <w:tcBorders>
               <w:top w:val="single" w:sz="2" w:space="0" w:color="000000"/>
-              <w:start w:val="single" w:sz="2" w:space="0" w:color="000000"/>
+              <w:left w:val="single" w:sz="2" w:space="0" w:color="000000"/>
               <w:bottom w:val="single" w:sz="2" w:space="0" w:color="000000"/>
-              <w:end w:val="single" w:sz="2" w:space="0" w:color="000000"/>
+              <w:right w:val="single" w:sz="2" w:space="0" w:color="000000"/>
             </w:tcBorders>
             <w:vAlign w:val="center"/>
           </w:tcPr>
           <w:p>
             <w:pPr>
               <w:pStyle w:val="Contenidodelatabla"/>
-              <w:bidi w:val="0"/>
-              <w:spacing w:lineRule="auto" w:line="273" w:before="0" w:after="140"/>
-              <w:ind w:hanging="0" w:start="0" w:end="0"/>
-              <w:jc w:val="start"/>
-              <w:rPr/>
+              <w:spacing w:after="140" w:line="273" w:lineRule="auto"/>
             </w:pPr>
             <w:r>
               <w:rPr>
@@ -852,6 +855,7 @@
               </w:rPr>
               <w:t xml:space="preserve">) para descomponer la columna </w:t>
             </w:r>
+            <w:proofErr w:type="spellStart"/>
             <w:r>
               <w:rPr>
                 <w:rStyle w:val="Textooriginal"/>
@@ -859,12 +863,14 @@
               </w:rPr>
               <w:t>Datos_Venta</w:t>
             </w:r>
+            <w:proofErr w:type="spellEnd"/>
             <w:r>
               <w:rPr>
                 <w:rFonts w:ascii="Google Sans Text;sans-serif" w:hAnsi="Google Sans Text;sans-serif"/>
               </w:rPr>
               <w:t xml:space="preserve"> en tres nuevas columnas analíticamente útiles: </w:t>
             </w:r>
+            <w:proofErr w:type="spellStart"/>
             <w:r>
               <w:rPr>
                 <w:rStyle w:val="Textooriginal"/>
@@ -872,12 +878,14 @@
               </w:rPr>
               <w:t>Nombre_Cliente</w:t>
             </w:r>
+            <w:proofErr w:type="spellEnd"/>
             <w:r>
               <w:rPr>
                 <w:rFonts w:ascii="Google Sans Text;sans-serif" w:hAnsi="Google Sans Text;sans-serif"/>
               </w:rPr>
               <w:t xml:space="preserve">, </w:t>
             </w:r>
+            <w:proofErr w:type="spellStart"/>
             <w:r>
               <w:rPr>
                 <w:rStyle w:val="Textooriginal"/>
@@ -885,12 +893,14 @@
               </w:rPr>
               <w:t>Categoría_Producto</w:t>
             </w:r>
+            <w:proofErr w:type="spellEnd"/>
             <w:r>
               <w:rPr>
                 <w:rFonts w:ascii="Google Sans Text;sans-serif" w:hAnsi="Google Sans Text;sans-serif"/>
               </w:rPr>
               <w:t xml:space="preserve"> y </w:t>
             </w:r>
+            <w:proofErr w:type="spellStart"/>
             <w:r>
               <w:rPr>
                 <w:rStyle w:val="Textooriginal"/>
@@ -898,6 +908,7 @@
               </w:rPr>
               <w:t>ID_Transacción</w:t>
             </w:r>
+            <w:proofErr w:type="spellEnd"/>
             <w:r>
               <w:rPr>
                 <w:rFonts w:ascii="Google Sans Text;sans-serif" w:hAnsi="Google Sans Text;sans-serif"/>
@@ -911,19 +922,16 @@
             <w:tcW w:w="2028" w:type="dxa"/>
             <w:tcBorders>
               <w:top w:val="single" w:sz="2" w:space="0" w:color="000000"/>
-              <w:start w:val="single" w:sz="2" w:space="0" w:color="000000"/>
+              <w:left w:val="single" w:sz="2" w:space="0" w:color="000000"/>
               <w:bottom w:val="single" w:sz="2" w:space="0" w:color="000000"/>
-              <w:end w:val="single" w:sz="2" w:space="0" w:color="000000"/>
+              <w:right w:val="single" w:sz="2" w:space="0" w:color="000000"/>
             </w:tcBorders>
             <w:vAlign w:val="center"/>
           </w:tcPr>
           <w:p>
             <w:pPr>
               <w:pStyle w:val="Contenidodelatabla"/>
-              <w:bidi w:val="0"/>
-              <w:spacing w:lineRule="auto" w:line="273" w:before="0" w:after="140"/>
-              <w:ind w:hanging="0" w:start="0" w:end="0"/>
-              <w:jc w:val="start"/>
+              <w:spacing w:after="140" w:line="273" w:lineRule="auto"/>
               <w:rPr>
                 <w:rFonts w:ascii="Google Sans Text;sans-serif" w:hAnsi="Google Sans Text;sans-serif"/>
                 <w:b/>
@@ -940,25 +948,21 @@
         </w:tc>
       </w:tr>
       <w:tr>
-        <w:trPr/>
         <w:tc>
           <w:tcPr>
             <w:tcW w:w="2448" w:type="dxa"/>
             <w:tcBorders>
               <w:top w:val="single" w:sz="2" w:space="0" w:color="000000"/>
-              <w:start w:val="single" w:sz="2" w:space="0" w:color="000000"/>
+              <w:left w:val="single" w:sz="2" w:space="0" w:color="000000"/>
               <w:bottom w:val="single" w:sz="2" w:space="0" w:color="000000"/>
-              <w:end w:val="single" w:sz="2" w:space="0" w:color="000000"/>
+              <w:right w:val="single" w:sz="2" w:space="0" w:color="000000"/>
             </w:tcBorders>
             <w:vAlign w:val="center"/>
           </w:tcPr>
           <w:p>
             <w:pPr>
               <w:pStyle w:val="Contenidodelatabla"/>
-              <w:bidi w:val="0"/>
-              <w:spacing w:lineRule="auto" w:line="273" w:before="0" w:after="140"/>
-              <w:ind w:hanging="0" w:start="0" w:end="0"/>
-              <w:jc w:val="start"/>
+              <w:spacing w:after="140" w:line="273" w:lineRule="auto"/>
               <w:rPr>
                 <w:rFonts w:ascii="Google Sans Text;sans-serif" w:hAnsi="Google Sans Text;sans-serif"/>
                 <w:b/>
@@ -978,20 +982,16 @@
             <w:tcW w:w="5496" w:type="dxa"/>
             <w:tcBorders>
               <w:top w:val="single" w:sz="2" w:space="0" w:color="000000"/>
-              <w:start w:val="single" w:sz="2" w:space="0" w:color="000000"/>
+              <w:left w:val="single" w:sz="2" w:space="0" w:color="000000"/>
               <w:bottom w:val="single" w:sz="2" w:space="0" w:color="000000"/>
-              <w:end w:val="single" w:sz="2" w:space="0" w:color="000000"/>
+              <w:right w:val="single" w:sz="2" w:space="0" w:color="000000"/>
             </w:tcBorders>
             <w:vAlign w:val="center"/>
           </w:tcPr>
           <w:p>
             <w:pPr>
               <w:pStyle w:val="Contenidodelatabla"/>
-              <w:bidi w:val="0"/>
-              <w:spacing w:lineRule="auto" w:line="273" w:before="0" w:after="140"/>
-              <w:ind w:hanging="0" w:start="0" w:end="0"/>
-              <w:jc w:val="start"/>
-              <w:rPr/>
+              <w:spacing w:after="140" w:line="273" w:lineRule="auto"/>
             </w:pPr>
             <w:r>
               <w:rPr>
@@ -1012,6 +1012,7 @@
               </w:rPr>
               <w:t xml:space="preserve"> para normalizar el campo </w:t>
             </w:r>
+            <w:proofErr w:type="spellStart"/>
             <w:r>
               <w:rPr>
                 <w:rStyle w:val="Textooriginal"/>
@@ -1019,6 +1020,7 @@
               </w:rPr>
               <w:t>Estado_Pago</w:t>
             </w:r>
+            <w:proofErr w:type="spellEnd"/>
             <w:r>
               <w:rPr>
                 <w:rFonts w:ascii="Google Sans Text;sans-serif" w:hAnsi="Google Sans Text;sans-serif"/>
@@ -1071,19 +1073,16 @@
             <w:tcW w:w="2028" w:type="dxa"/>
             <w:tcBorders>
               <w:top w:val="single" w:sz="2" w:space="0" w:color="000000"/>
-              <w:start w:val="single" w:sz="2" w:space="0" w:color="000000"/>
+              <w:left w:val="single" w:sz="2" w:space="0" w:color="000000"/>
               <w:bottom w:val="single" w:sz="2" w:space="0" w:color="000000"/>
-              <w:end w:val="single" w:sz="2" w:space="0" w:color="000000"/>
+              <w:right w:val="single" w:sz="2" w:space="0" w:color="000000"/>
             </w:tcBorders>
             <w:vAlign w:val="center"/>
           </w:tcPr>
           <w:p>
             <w:pPr>
               <w:pStyle w:val="Contenidodelatabla"/>
-              <w:bidi w:val="0"/>
-              <w:spacing w:lineRule="auto" w:line="273" w:before="0" w:after="140"/>
-              <w:ind w:hanging="0" w:start="0" w:end="0"/>
-              <w:jc w:val="start"/>
+              <w:spacing w:after="140" w:line="273" w:lineRule="auto"/>
               <w:rPr>
                 <w:rFonts w:ascii="Google Sans Text;sans-serif" w:hAnsi="Google Sans Text;sans-serif"/>
                 <w:b/>
@@ -1100,25 +1099,21 @@
         </w:tc>
       </w:tr>
       <w:tr>
-        <w:trPr/>
         <w:tc>
           <w:tcPr>
             <w:tcW w:w="2448" w:type="dxa"/>
             <w:tcBorders>
               <w:top w:val="single" w:sz="2" w:space="0" w:color="000000"/>
-              <w:start w:val="single" w:sz="2" w:space="0" w:color="000000"/>
+              <w:left w:val="single" w:sz="2" w:space="0" w:color="000000"/>
               <w:bottom w:val="single" w:sz="2" w:space="0" w:color="000000"/>
-              <w:end w:val="single" w:sz="2" w:space="0" w:color="000000"/>
+              <w:right w:val="single" w:sz="2" w:space="0" w:color="000000"/>
             </w:tcBorders>
             <w:vAlign w:val="center"/>
           </w:tcPr>
           <w:p>
             <w:pPr>
               <w:pStyle w:val="Contenidodelatabla"/>
-              <w:bidi w:val="0"/>
-              <w:spacing w:lineRule="auto" w:line="273" w:before="0" w:after="140"/>
-              <w:ind w:hanging="0" w:start="0" w:end="0"/>
-              <w:jc w:val="start"/>
+              <w:spacing w:after="140" w:line="273" w:lineRule="auto"/>
               <w:rPr>
                 <w:rFonts w:ascii="Google Sans Text;sans-serif" w:hAnsi="Google Sans Text;sans-serif"/>
                 <w:b/>
@@ -1138,20 +1133,16 @@
             <w:tcW w:w="5496" w:type="dxa"/>
             <w:tcBorders>
               <w:top w:val="single" w:sz="2" w:space="0" w:color="000000"/>
-              <w:start w:val="single" w:sz="2" w:space="0" w:color="000000"/>
+              <w:left w:val="single" w:sz="2" w:space="0" w:color="000000"/>
               <w:bottom w:val="single" w:sz="2" w:space="0" w:color="000000"/>
-              <w:end w:val="single" w:sz="2" w:space="0" w:color="000000"/>
+              <w:right w:val="single" w:sz="2" w:space="0" w:color="000000"/>
             </w:tcBorders>
             <w:vAlign w:val="center"/>
           </w:tcPr>
           <w:p>
             <w:pPr>
               <w:pStyle w:val="Contenidodelatabla"/>
-              <w:bidi w:val="0"/>
-              <w:spacing w:lineRule="auto" w:line="273" w:before="0" w:after="140"/>
-              <w:ind w:hanging="0" w:start="0" w:end="0"/>
-              <w:jc w:val="start"/>
-              <w:rPr/>
+              <w:spacing w:after="140" w:line="273" w:lineRule="auto"/>
             </w:pPr>
             <w:r>
               <w:rPr>
@@ -1205,19 +1196,16 @@
             <w:tcW w:w="2028" w:type="dxa"/>
             <w:tcBorders>
               <w:top w:val="single" w:sz="2" w:space="0" w:color="000000"/>
-              <w:start w:val="single" w:sz="2" w:space="0" w:color="000000"/>
+              <w:left w:val="single" w:sz="2" w:space="0" w:color="000000"/>
               <w:bottom w:val="single" w:sz="2" w:space="0" w:color="000000"/>
-              <w:end w:val="single" w:sz="2" w:space="0" w:color="000000"/>
+              <w:right w:val="single" w:sz="2" w:space="0" w:color="000000"/>
             </w:tcBorders>
             <w:vAlign w:val="center"/>
           </w:tcPr>
           <w:p>
             <w:pPr>
               <w:pStyle w:val="Contenidodelatabla"/>
-              <w:bidi w:val="0"/>
-              <w:spacing w:lineRule="auto" w:line="273" w:before="0" w:after="140"/>
-              <w:ind w:hanging="0" w:start="0" w:end="0"/>
-              <w:jc w:val="start"/>
+              <w:spacing w:after="140" w:line="273" w:lineRule="auto"/>
               <w:rPr>
                 <w:rFonts w:ascii="Google Sans Text;sans-serif" w:hAnsi="Google Sans Text;sans-serif"/>
                 <w:b/>
@@ -1234,25 +1222,21 @@
         </w:tc>
       </w:tr>
       <w:tr>
-        <w:trPr/>
         <w:tc>
           <w:tcPr>
             <w:tcW w:w="2448" w:type="dxa"/>
             <w:tcBorders>
               <w:top w:val="single" w:sz="2" w:space="0" w:color="000000"/>
-              <w:start w:val="single" w:sz="2" w:space="0" w:color="000000"/>
+              <w:left w:val="single" w:sz="2" w:space="0" w:color="000000"/>
               <w:bottom w:val="single" w:sz="2" w:space="0" w:color="000000"/>
-              <w:end w:val="single" w:sz="2" w:space="0" w:color="000000"/>
+              <w:right w:val="single" w:sz="2" w:space="0" w:color="000000"/>
             </w:tcBorders>
             <w:vAlign w:val="center"/>
           </w:tcPr>
           <w:p>
             <w:pPr>
               <w:pStyle w:val="Contenidodelatabla"/>
-              <w:bidi w:val="0"/>
-              <w:spacing w:lineRule="auto" w:line="273" w:before="0" w:after="140"/>
-              <w:ind w:hanging="0" w:start="0" w:end="0"/>
-              <w:jc w:val="start"/>
+              <w:spacing w:after="140" w:line="273" w:lineRule="auto"/>
               <w:rPr>
                 <w:rFonts w:ascii="Google Sans Text;sans-serif" w:hAnsi="Google Sans Text;sans-serif"/>
                 <w:b/>
@@ -1272,20 +1256,16 @@
             <w:tcW w:w="5496" w:type="dxa"/>
             <w:tcBorders>
               <w:top w:val="single" w:sz="2" w:space="0" w:color="000000"/>
-              <w:start w:val="single" w:sz="2" w:space="0" w:color="000000"/>
+              <w:left w:val="single" w:sz="2" w:space="0" w:color="000000"/>
               <w:bottom w:val="single" w:sz="2" w:space="0" w:color="000000"/>
-              <w:end w:val="single" w:sz="2" w:space="0" w:color="000000"/>
+              <w:right w:val="single" w:sz="2" w:space="0" w:color="000000"/>
             </w:tcBorders>
             <w:vAlign w:val="center"/>
           </w:tcPr>
           <w:p>
             <w:pPr>
               <w:pStyle w:val="Contenidodelatabla"/>
-              <w:bidi w:val="0"/>
-              <w:spacing w:lineRule="auto" w:line="273" w:before="0" w:after="140"/>
-              <w:ind w:hanging="0" w:start="0" w:end="0"/>
-              <w:jc w:val="start"/>
-              <w:rPr/>
+              <w:spacing w:after="140" w:line="273" w:lineRule="auto"/>
             </w:pPr>
             <w:r>
               <w:rPr>
@@ -1293,6 +1273,7 @@
               </w:rPr>
               <w:t xml:space="preserve">Se identificaron los campos vacíos en </w:t>
             </w:r>
+            <w:proofErr w:type="spellStart"/>
             <w:r>
               <w:rPr>
                 <w:rStyle w:val="Textooriginal"/>
@@ -1300,6 +1281,7 @@
               </w:rPr>
               <w:t>Estado_Pago</w:t>
             </w:r>
+            <w:proofErr w:type="spellEnd"/>
             <w:r>
               <w:rPr>
                 <w:rFonts w:ascii="Google Sans Text;sans-serif" w:hAnsi="Google Sans Text;sans-serif"/>
@@ -1339,19 +1321,16 @@
             <w:tcW w:w="2028" w:type="dxa"/>
             <w:tcBorders>
               <w:top w:val="single" w:sz="2" w:space="0" w:color="000000"/>
-              <w:start w:val="single" w:sz="2" w:space="0" w:color="000000"/>
+              <w:left w:val="single" w:sz="2" w:space="0" w:color="000000"/>
               <w:bottom w:val="single" w:sz="2" w:space="0" w:color="000000"/>
-              <w:end w:val="single" w:sz="2" w:space="0" w:color="000000"/>
+              <w:right w:val="single" w:sz="2" w:space="0" w:color="000000"/>
             </w:tcBorders>
             <w:vAlign w:val="center"/>
           </w:tcPr>
           <w:p>
             <w:pPr>
               <w:pStyle w:val="Contenidodelatabla"/>
-              <w:bidi w:val="0"/>
-              <w:spacing w:lineRule="auto" w:line="273" w:before="0" w:after="140"/>
-              <w:ind w:hanging="0" w:start="0" w:end="0"/>
-              <w:jc w:val="start"/>
+              <w:spacing w:after="140" w:line="273" w:lineRule="auto"/>
               <w:rPr>
                 <w:rFonts w:ascii="Google Sans Text;sans-serif" w:hAnsi="Google Sans Text;sans-serif"/>
                 <w:b/>
@@ -1368,25 +1347,21 @@
         </w:tc>
       </w:tr>
       <w:tr>
-        <w:trPr/>
         <w:tc>
           <w:tcPr>
             <w:tcW w:w="2448" w:type="dxa"/>
             <w:tcBorders>
               <w:top w:val="single" w:sz="2" w:space="0" w:color="000000"/>
-              <w:start w:val="single" w:sz="2" w:space="0" w:color="000000"/>
+              <w:left w:val="single" w:sz="2" w:space="0" w:color="000000"/>
               <w:bottom w:val="single" w:sz="2" w:space="0" w:color="000000"/>
-              <w:end w:val="single" w:sz="2" w:space="0" w:color="000000"/>
+              <w:right w:val="single" w:sz="2" w:space="0" w:color="000000"/>
             </w:tcBorders>
             <w:vAlign w:val="center"/>
           </w:tcPr>
           <w:p>
             <w:pPr>
               <w:pStyle w:val="Contenidodelatabla"/>
-              <w:bidi w:val="0"/>
-              <w:spacing w:lineRule="auto" w:line="273" w:before="0" w:after="140"/>
-              <w:ind w:hanging="0" w:start="0" w:end="0"/>
-              <w:jc w:val="start"/>
+              <w:spacing w:after="140" w:line="273" w:lineRule="auto"/>
               <w:rPr>
                 <w:rFonts w:ascii="Google Sans Text;sans-serif" w:hAnsi="Google Sans Text;sans-serif"/>
                 <w:b/>
@@ -1406,20 +1381,16 @@
             <w:tcW w:w="5496" w:type="dxa"/>
             <w:tcBorders>
               <w:top w:val="single" w:sz="2" w:space="0" w:color="000000"/>
-              <w:start w:val="single" w:sz="2" w:space="0" w:color="000000"/>
+              <w:left w:val="single" w:sz="2" w:space="0" w:color="000000"/>
               <w:bottom w:val="single" w:sz="2" w:space="0" w:color="000000"/>
-              <w:end w:val="single" w:sz="2" w:space="0" w:color="000000"/>
+              <w:right w:val="single" w:sz="2" w:space="0" w:color="000000"/>
             </w:tcBorders>
             <w:vAlign w:val="center"/>
           </w:tcPr>
           <w:p>
             <w:pPr>
               <w:pStyle w:val="Contenidodelatabla"/>
-              <w:bidi w:val="0"/>
-              <w:spacing w:lineRule="auto" w:line="273" w:before="0" w:after="140"/>
-              <w:ind w:hanging="0" w:start="0" w:end="0"/>
-              <w:jc w:val="start"/>
-              <w:rPr/>
+              <w:spacing w:after="140" w:line="273" w:lineRule="auto"/>
             </w:pPr>
             <w:r>
               <w:rPr>
@@ -1440,6 +1411,7 @@
               </w:rPr>
               <w:t xml:space="preserve"> en la columna </w:t>
             </w:r>
+            <w:proofErr w:type="spellStart"/>
             <w:r>
               <w:rPr>
                 <w:rStyle w:val="Textooriginal"/>
@@ -1447,6 +1419,7 @@
               </w:rPr>
               <w:t>Estado_Pago</w:t>
             </w:r>
+            <w:proofErr w:type="spellEnd"/>
             <w:r>
               <w:rPr>
                 <w:rFonts w:ascii="Google Sans Text;sans-serif" w:hAnsi="Google Sans Text;sans-serif"/>
@@ -1460,19 +1433,16 @@
             <w:tcW w:w="2028" w:type="dxa"/>
             <w:tcBorders>
               <w:top w:val="single" w:sz="2" w:space="0" w:color="000000"/>
-              <w:start w:val="single" w:sz="2" w:space="0" w:color="000000"/>
+              <w:left w:val="single" w:sz="2" w:space="0" w:color="000000"/>
               <w:bottom w:val="single" w:sz="2" w:space="0" w:color="000000"/>
-              <w:end w:val="single" w:sz="2" w:space="0" w:color="000000"/>
+              <w:right w:val="single" w:sz="2" w:space="0" w:color="000000"/>
             </w:tcBorders>
             <w:vAlign w:val="center"/>
           </w:tcPr>
           <w:p>
             <w:pPr>
               <w:pStyle w:val="Contenidodelatabla"/>
-              <w:bidi w:val="0"/>
-              <w:spacing w:lineRule="auto" w:line="273" w:before="0" w:after="140"/>
-              <w:ind w:hanging="0" w:start="0" w:end="0"/>
-              <w:jc w:val="start"/>
+              <w:spacing w:after="140" w:line="273" w:lineRule="auto"/>
               <w:rPr>
                 <w:rFonts w:ascii="Google Sans Text;sans-serif" w:hAnsi="Google Sans Text;sans-serif"/>
                 <w:b/>
@@ -1491,11 +1461,8 @@
     </w:tbl>
     <w:p>
       <w:pPr>
-        <w:pStyle w:val="Heading3"/>
-        <w:bidi w:val="0"/>
-        <w:spacing w:lineRule="auto" w:line="273" w:before="0" w:after="140"/>
-        <w:ind w:hanging="0" w:start="0" w:end="0"/>
-        <w:jc w:val="start"/>
+        <w:pStyle w:val="Ttulo3"/>
+        <w:spacing w:before="0" w:after="140" w:line="273" w:lineRule="auto"/>
         <w:rPr>
           <w:rFonts w:ascii="Google Sans;sans-serif" w:hAnsi="Google Sans;sans-serif"/>
         </w:rPr>
@@ -1509,21 +1476,15 @@
     </w:p>
     <w:p>
       <w:pPr>
-        <w:pStyle w:val="BodyText"/>
+        <w:pStyle w:val="Textoindependiente"/>
         <w:numPr>
           <w:ilvl w:val="0"/>
           <w:numId w:val="3"/>
         </w:numPr>
-        <w:pBdr/>
-        <w:tabs>
-          <w:tab w:val="clear" w:pos="709"/>
-          <w:tab w:val="left" w:pos="709" w:leader="none"/>
-        </w:tabs>
-        <w:bidi w:val="0"/>
-        <w:spacing w:lineRule="auto" w:line="273" w:before="0" w:after="140"/>
-        <w:ind w:hanging="283" w:start="709" w:end="0"/>
-        <w:jc w:val="start"/>
-        <w:rPr/>
+        <w:tabs>
+          <w:tab w:val="left" w:pos="709"/>
+        </w:tabs>
+        <w:spacing w:line="273" w:lineRule="auto"/>
       </w:pPr>
       <w:r>
         <w:rPr>
@@ -1538,6 +1499,7 @@
         </w:rPr>
         <w:t xml:space="preserve"> Se logró transformar una base de datos con 4 columnas inconsistentes y combinadas en un conjunto de datos limpio con 7 columnas funcionales, listas para el análisis. La estandarización del </w:t>
       </w:r>
+      <w:proofErr w:type="spellStart"/>
       <w:r>
         <w:rPr>
           <w:rStyle w:val="Textooriginal"/>
@@ -1545,6 +1507,7 @@
         </w:rPr>
         <w:t>Estado_Pago</w:t>
       </w:r>
+      <w:proofErr w:type="spellEnd"/>
       <w:r>
         <w:rPr>
           <w:rFonts w:ascii="Google Sans Text;sans-serif" w:hAnsi="Google Sans Text;sans-serif"/>
@@ -1554,20 +1517,15 @@
     </w:p>
     <w:p>
       <w:pPr>
-        <w:pStyle w:val="BodyText"/>
+        <w:pStyle w:val="Textoindependiente"/>
         <w:numPr>
           <w:ilvl w:val="0"/>
           <w:numId w:val="3"/>
         </w:numPr>
-        <w:pBdr/>
-        <w:tabs>
-          <w:tab w:val="clear" w:pos="709"/>
-          <w:tab w:val="left" w:pos="709" w:leader="none"/>
-        </w:tabs>
-        <w:bidi w:val="0"/>
-        <w:spacing w:lineRule="auto" w:line="273" w:before="0" w:after="140"/>
-        <w:ind w:hanging="283" w:start="709" w:end="0"/>
-        <w:jc w:val="start"/>
+        <w:tabs>
+          <w:tab w:val="left" w:pos="709"/>
+        </w:tabs>
+        <w:spacing w:line="273" w:lineRule="auto"/>
         <w:rPr>
           <w:rFonts w:ascii="Google Sans Text;sans-serif" w:hAnsi="Google Sans Text;sans-serif"/>
         </w:rPr>
@@ -1596,16 +1554,27 @@
         <w:rPr>
           <w:rFonts w:ascii="Google Sans Text;sans-serif" w:hAnsi="Google Sans Text;sans-serif"/>
         </w:rPr>
-        <w:t xml:space="preserve"> desde el origen, BiciGo ahora puede confiar en sus métricas clave. Esto elimina el riesgo de tomar decisiones de inversión o marketing basadas en conteos erróneos de ventas o segmentos de clientes. El proyecto estableció una buena práctica para el control de calidad en futuros ingresos de datos.</w:t>
+        <w:t xml:space="preserve"> desde el origen, </w:t>
+      </w:r>
+      <w:proofErr w:type="spellStart"/>
+      <w:r>
+        <w:rPr>
+          <w:rFonts w:ascii="Google Sans Text;sans-serif" w:hAnsi="Google Sans Text;sans-serif"/>
+        </w:rPr>
+        <w:t>BiciGo</w:t>
+      </w:r>
+      <w:proofErr w:type="spellEnd"/>
+      <w:r>
+        <w:rPr>
+          <w:rFonts w:ascii="Google Sans Text;sans-serif" w:hAnsi="Google Sans Text;sans-serif"/>
+        </w:rPr>
+        <w:t xml:space="preserve"> ahora puede confiar en sus métricas clave. Esto elimina el riesgo de tomar decisiones de inversión o marketing basadas en conteos erróneos de ventas o segmentos de clientes. El proyecto estableció una buena práctica para el control de calidad en futuros ingresos de datos.</w:t>
       </w:r>
     </w:p>
     <w:p>
       <w:pPr>
-        <w:pStyle w:val="Heading3"/>
-        <w:bidi w:val="0"/>
-        <w:spacing w:lineRule="auto" w:line="273" w:before="0" w:after="140"/>
-        <w:ind w:hanging="0" w:start="0" w:end="0"/>
-        <w:jc w:val="start"/>
+        <w:pStyle w:val="Ttulo3"/>
+        <w:spacing w:before="0" w:after="140" w:line="273" w:lineRule="auto"/>
         <w:rPr>
           <w:rFonts w:ascii="Google Sans;sans-serif" w:hAnsi="Google Sans;sans-serif"/>
         </w:rPr>
@@ -1619,79 +1588,103 @@
     </w:p>
     <w:p>
       <w:pPr>
-        <w:pStyle w:val="BodyText"/>
+        <w:pStyle w:val="Textoindependiente"/>
         <w:numPr>
           <w:ilvl w:val="0"/>
           <w:numId w:val="4"/>
         </w:numPr>
-        <w:pBdr/>
-        <w:tabs>
-          <w:tab w:val="clear" w:pos="709"/>
-          <w:tab w:val="left" w:pos="709" w:leader="none"/>
-        </w:tabs>
-        <w:bidi w:val="0"/>
-        <w:spacing w:lineRule="auto" w:line="273" w:before="0" w:after="140"/>
-        <w:ind w:hanging="283" w:start="709" w:end="0"/>
-        <w:jc w:val="start"/>
-        <w:rPr/>
-      </w:pPr>
-      <w:r>
-        <w:rPr>
-          <w:rFonts w:ascii="Google Sans Text;sans-serif" w:hAnsi="Google Sans Text;sans-serif"/>
-        </w:rPr>
-        <w:t xml:space="preserve">[Insertar una imagen que muestre la tabla de datos </w:t>
-      </w:r>
-      <w:r>
-        <w:rPr>
-          <w:rFonts w:ascii="Google Sans Text;sans-serif" w:hAnsi="Google Sans Text;sans-serif"/>
-          <w:b/>
-        </w:rPr>
-        <w:t>después</w:t>
-      </w:r>
-      <w:r>
-        <w:rPr>
-          <w:rFonts w:ascii="Google Sans Text;sans-serif" w:hAnsi="Google Sans Text;sans-serif"/>
-        </w:rPr>
-        <w:t xml:space="preserve"> de usar "Texto en Columnas", donde </w:t>
-      </w:r>
-      <w:r>
-        <w:rPr>
-          <w:rStyle w:val="Textooriginal"/>
-          <w:rFonts w:ascii="Google Sans Text;sans-serif" w:hAnsi="Google Sans Text;sans-serif"/>
-        </w:rPr>
-        <w:t>Datos_Venta</w:t>
-      </w:r>
-      <w:r>
-        <w:rPr>
-          <w:rFonts w:ascii="Google Sans Text;sans-serif" w:hAnsi="Google Sans Text;sans-serif"/>
-        </w:rPr>
-        <w:t xml:space="preserve"> está dividida en 3 columnas limpias.]</w:t>
+        <w:tabs>
+          <w:tab w:val="left" w:pos="709"/>
+        </w:tabs>
+        <w:spacing w:line="273" w:lineRule="auto"/>
+      </w:pPr>
+      <w:r>
+        <w:t>Limpieza de datos a partir de datos originales (Imagen)</w:t>
       </w:r>
     </w:p>
     <w:p>
       <w:pPr>
-        <w:pStyle w:val="BodyText"/>
+        <w:pStyle w:val="Textoindependiente"/>
+        <w:tabs>
+          <w:tab w:val="left" w:pos="709"/>
+        </w:tabs>
+        <w:spacing w:line="273" w:lineRule="auto"/>
+      </w:pPr>
+      <w:r>
+        <w:rPr>
+          <w:noProof/>
+        </w:rPr>
+        <w:drawing>
+          <wp:inline distT="0" distB="0" distL="0" distR="0" wp14:anchorId="504F250C" wp14:editId="61509205">
+            <wp:extent cx="9158759" cy="3000375"/>
+            <wp:effectExtent l="0" t="0" r="4445" b="0"/>
+            <wp:docPr id="1299380817" name="Imagen 1"/>
+            <wp:cNvGraphicFramePr>
+              <a:graphicFrameLocks xmlns:a="http://schemas.openxmlformats.org/drawingml/2006/main" noChangeAspect="1"/>
+            </wp:cNvGraphicFramePr>
+            <a:graphic xmlns:a="http://schemas.openxmlformats.org/drawingml/2006/main">
+              <a:graphicData uri="http://schemas.openxmlformats.org/drawingml/2006/picture">
+                <pic:pic xmlns:pic="http://schemas.openxmlformats.org/drawingml/2006/picture">
+                  <pic:nvPicPr>
+                    <pic:cNvPr id="0" name="Picture 1"/>
+                    <pic:cNvPicPr>
+                      <a:picLocks noChangeAspect="1" noChangeArrowheads="1"/>
+                    </pic:cNvPicPr>
+                  </pic:nvPicPr>
+                  <pic:blipFill>
+                    <a:blip r:embed="rId5">
+                      <a:extLst>
+                        <a:ext uri="{28A0092B-C50C-407E-A947-70E740481C1C}">
+                          <a14:useLocalDpi xmlns:a14="http://schemas.microsoft.com/office/drawing/2010/main" val="0"/>
+                        </a:ext>
+                      </a:extLst>
+                    </a:blip>
+                    <a:srcRect/>
+                    <a:stretch>
+                      <a:fillRect/>
+                    </a:stretch>
+                  </pic:blipFill>
+                  <pic:spPr bwMode="auto">
+                    <a:xfrm>
+                      <a:off x="0" y="0"/>
+                      <a:ext cx="9162864" cy="3001720"/>
+                    </a:xfrm>
+                    <a:prstGeom prst="rect">
+                      <a:avLst/>
+                    </a:prstGeom>
+                    <a:noFill/>
+                    <a:ln>
+                      <a:noFill/>
+                    </a:ln>
+                  </pic:spPr>
+                </pic:pic>
+              </a:graphicData>
+            </a:graphic>
+          </wp:inline>
+        </w:drawing>
+      </w:r>
+    </w:p>
+    <w:p>
+      <w:pPr>
+        <w:pStyle w:val="Textoindependiente"/>
+        <w:tabs>
+          <w:tab w:val="left" w:pos="709"/>
+        </w:tabs>
+        <w:spacing w:line="273" w:lineRule="auto"/>
+      </w:pPr>
+    </w:p>
+    <w:p>
+      <w:pPr>
+        <w:pStyle w:val="Textoindependiente"/>
         <w:numPr>
           <w:ilvl w:val="0"/>
           <w:numId w:val="4"/>
         </w:numPr>
-        <w:pBdr/>
-        <w:tabs>
-          <w:tab w:val="clear" w:pos="709"/>
-          <w:tab w:val="left" w:pos="709" w:leader="none"/>
-        </w:tabs>
-        <w:bidi w:val="0"/>
-        <w:spacing w:lineRule="auto" w:line="273" w:before="0" w:after="140"/>
-        <w:ind w:hanging="283" w:start="709" w:end="0"/>
-        <w:jc w:val="start"/>
-        <w:rPr/>
-      </w:pPr>
-      <w:r>
-        <w:rPr>
-          <w:rFonts w:ascii="Google Sans Text;sans-serif" w:hAnsi="Google Sans Text;sans-serif"/>
-        </w:rPr>
-        <w:t xml:space="preserve">[Insertar una imagen de la ventana de </w:t>
-      </w:r>
+        <w:tabs>
+          <w:tab w:val="left" w:pos="709"/>
+        </w:tabs>
+        <w:spacing w:line="273" w:lineRule="auto"/>
+      </w:pPr>
       <w:r>
         <w:rPr>
           <w:rFonts w:ascii="Google Sans Text;sans-serif" w:hAnsi="Google Sans Text;sans-serif"/>
@@ -1705,6 +1698,7 @@
         </w:rPr>
         <w:t xml:space="preserve"> de Excel mostrando la lista de opciones estandarizadas para </w:t>
       </w:r>
+      <w:proofErr w:type="spellStart"/>
       <w:r>
         <w:rPr>
           <w:rStyle w:val="Textooriginal"/>
@@ -1712,49 +1706,103 @@
         </w:rPr>
         <w:t>Estado_Pago</w:t>
       </w:r>
-      <w:r>
-        <w:rPr>
-          <w:rFonts w:ascii="Google Sans Text;sans-serif" w:hAnsi="Google Sans Text;sans-serif"/>
-        </w:rPr>
-        <w:t>.]</w:t>
+      <w:proofErr w:type="spellEnd"/>
+      <w:r>
+        <w:rPr>
+          <w:rFonts w:ascii="Google Sans Text;sans-serif" w:hAnsi="Google Sans Text;sans-serif"/>
+        </w:rPr>
+        <w:t>.</w:t>
       </w:r>
     </w:p>
     <w:p>
       <w:pPr>
-        <w:pStyle w:val="Normal"/>
-        <w:bidi w:val="0"/>
-        <w:jc w:val="start"/>
-        <w:rPr/>
-      </w:pPr>
-      <w:r>
-        <w:rPr/>
+        <w:pStyle w:val="Textoindependiente"/>
+        <w:tabs>
+          <w:tab w:val="left" w:pos="709"/>
+        </w:tabs>
+        <w:spacing w:line="273" w:lineRule="auto"/>
+      </w:pPr>
+      <w:r>
+        <w:rPr>
+          <w:noProof/>
+        </w:rPr>
+        <w:drawing>
+          <wp:inline distT="0" distB="0" distL="0" distR="0" wp14:anchorId="7CDDEAEE" wp14:editId="72DCE389">
+            <wp:extent cx="9247271" cy="3265715"/>
+            <wp:effectExtent l="0" t="0" r="0" b="0"/>
+            <wp:docPr id="1718300126" name="Imagen 2"/>
+            <wp:cNvGraphicFramePr>
+              <a:graphicFrameLocks xmlns:a="http://schemas.openxmlformats.org/drawingml/2006/main" noChangeAspect="1"/>
+            </wp:cNvGraphicFramePr>
+            <a:graphic xmlns:a="http://schemas.openxmlformats.org/drawingml/2006/main">
+              <a:graphicData uri="http://schemas.openxmlformats.org/drawingml/2006/picture">
+                <pic:pic xmlns:pic="http://schemas.openxmlformats.org/drawingml/2006/picture">
+                  <pic:nvPicPr>
+                    <pic:cNvPr id="0" name="Picture 2"/>
+                    <pic:cNvPicPr>
+                      <a:picLocks noChangeAspect="1" noChangeArrowheads="1"/>
+                    </pic:cNvPicPr>
+                  </pic:nvPicPr>
+                  <pic:blipFill>
+                    <a:blip r:embed="rId6">
+                      <a:extLst>
+                        <a:ext uri="{28A0092B-C50C-407E-A947-70E740481C1C}">
+                          <a14:useLocalDpi xmlns:a14="http://schemas.microsoft.com/office/drawing/2010/main" val="0"/>
+                        </a:ext>
+                      </a:extLst>
+                    </a:blip>
+                    <a:srcRect/>
+                    <a:stretch>
+                      <a:fillRect/>
+                    </a:stretch>
+                  </pic:blipFill>
+                  <pic:spPr bwMode="auto">
+                    <a:xfrm>
+                      <a:off x="0" y="0"/>
+                      <a:ext cx="9279840" cy="3277217"/>
+                    </a:xfrm>
+                    <a:prstGeom prst="rect">
+                      <a:avLst/>
+                    </a:prstGeom>
+                    <a:noFill/>
+                    <a:ln>
+                      <a:noFill/>
+                    </a:ln>
+                  </pic:spPr>
+                </pic:pic>
+              </a:graphicData>
+            </a:graphic>
+          </wp:inline>
+        </w:drawing>
       </w:r>
     </w:p>
+    <w:p/>
     <w:sectPr>
-      <w:type w:val="nextPage"/>
       <w:pgSz w:w="12240" w:h="15840"/>
-      <w:pgMar w:left="1134" w:right="1134" w:gutter="0" w:header="0" w:top="1134" w:footer="0" w:bottom="1134"/>
-      <w:pgNumType w:fmt="decimal"/>
-      <w:formProt w:val="false"/>
-      <w:textDirection w:val="lrTb"/>
+      <w:pgMar w:top="1134" w:right="1134" w:bottom="1134" w:left="1134" w:header="0" w:footer="0" w:gutter="0"/>
+      <w:cols w:space="720"/>
+      <w:formProt w:val="0"/>
     </w:sectPr>
   </w:body>
 </w:document>
 </file>
 
 <file path=word/numbering.xml><?xml version="1.0" encoding="utf-8"?>
-<w:numbering xmlns:w="http://schemas.openxmlformats.org/wordprocessingml/2006/main" xmlns:o="urn:schemas-microsoft-com:office:office" xmlns:r="http://schemas.openxmlformats.org/officeDocument/2006/relationships" xmlns:v="urn:schemas-microsoft-com:vml" xmlns:mc="http://schemas.openxmlformats.org/markup-compatibility/2006" xmlns:w14="http://schemas.microsoft.com/office/word/2010/wordml" mc:Ignorable="w14">
-  <w:abstractNum w:abstractNumId="1">
+<w:numbering xmlns:wpc="http://schemas.microsoft.com/office/word/2010/wordprocessingCanvas" xmlns:cx="http://schemas.microsoft.com/office/drawing/2014/chartex" xmlns:cx1="http://schemas.microsoft.com/office/drawing/2015/9/8/chartex" xmlns:cx2="http://schemas.microsoft.com/office/drawing/2015/10/21/chartex" xmlns:cx3="http://schemas.microsoft.com/office/drawing/2016/5/9/chartex" xmlns:cx4="http://schemas.microsoft.com/office/drawing/2016/5/10/chartex" xmlns:cx5="http://schemas.microsoft.com/office/drawing/2016/5/11/chartex" xmlns:cx6="http://schemas.microsoft.com/office/drawing/2016/5/12/chartex" xmlns:cx7="http://schemas.microsoft.com/office/drawing/2016/5/13/chartex" xmlns:cx8="http://schemas.microsoft.com/office/drawing/2016/5/14/chartex" xmlns:mc="http://schemas.openxmlformats.org/markup-compatibility/2006" xmlns:aink="http://schemas.microsoft.com/office/drawing/2016/ink" xmlns:am3d="http://schemas.microsoft.com/office/drawing/2017/model3d" xmlns:o="urn:schemas-microsoft-com:office:office" xmlns:oel="http://schemas.microsoft.com/office/2019/extlst" xmlns:r="http://schemas.openxmlformats.org/officeDocument/2006/relationships" xmlns:m="http://schemas.openxmlformats.org/officeDocument/2006/math" xmlns:v="urn:schemas-microsoft-com:vml" xmlns:wp14="http://schemas.microsoft.com/office/word/2010/wordprocessingDrawing" xmlns:wp="http://schemas.openxmlformats.org/drawingml/2006/wordprocessingDrawing" xmlns:w10="urn:schemas-microsoft-com:office:word" xmlns:w="http://schemas.openxmlformats.org/wordprocessingml/2006/main" xmlns:w14="http://schemas.microsoft.com/office/word/2010/wordml" xmlns:w15="http://schemas.microsoft.com/office/word/2012/wordml" xmlns:w16cex="http://schemas.microsoft.com/office/word/2018/wordml/cex" xmlns:w16cid="http://schemas.microsoft.com/office/word/2016/wordml/cid" xmlns:w16="http://schemas.microsoft.com/office/word/2018/wordml" xmlns:w16du="http://schemas.microsoft.com/office/word/2023/wordml/word16du" xmlns:w16sdtdh="http://schemas.microsoft.com/office/word/2020/wordml/sdtdatahash" xmlns:w16sdtfl="http://schemas.microsoft.com/office/word/2024/wordml/sdtformatlock" xmlns:w16se="http://schemas.microsoft.com/office/word/2015/wordml/symex" xmlns:wpg="http://schemas.microsoft.com/office/word/2010/wordprocessingGroup" xmlns:wpi="http://schemas.microsoft.com/office/word/2010/wordprocessingInk" xmlns:wne="http://schemas.microsoft.com/office/word/2006/wordml" xmlns:wps="http://schemas.microsoft.com/office/word/2010/wordprocessingShape" mc:Ignorable="w14 w15 w16se w16cid w16 w16cex w16sdtdh w16sdtfl w16du wp14">
+  <w:abstractNum w:abstractNumId="0" w15:restartNumberingAfterBreak="0">
+    <w:nsid w:val="1794438A"/>
+    <w:multiLevelType w:val="multilevel"/>
+    <w:tmpl w:val="8A569C74"/>
     <w:lvl w:ilvl="0">
       <w:start w:val="1"/>
       <w:numFmt w:val="bullet"/>
       <w:lvlText w:val=""/>
-      <w:lvlJc w:val="start"/>
+      <w:lvlJc w:val="left"/>
       <w:pPr>
         <w:tabs>
           <w:tab w:val="num" w:pos="709"/>
         </w:tabs>
-        <w:ind w:start="709" w:hanging="283"/>
+        <w:ind w:left="709" w:hanging="283"/>
       </w:pPr>
       <w:rPr>
         <w:rFonts w:ascii="Symbol" w:hAnsi="Symbol" w:cs="Symbol" w:hint="default"/>
@@ -1762,257 +1810,377 @@
     </w:lvl>
     <w:lvl w:ilvl="1">
       <w:start w:val="1"/>
-      <w:numFmt w:val="decimal"/>
-      <w:lvlText w:val="%2."/>
-      <w:lvlJc w:val="start"/>
-      <w:pPr>
-        <w:tabs>
-          <w:tab w:val="num" w:pos="1418"/>
-        </w:tabs>
-        <w:ind w:start="1418" w:hanging="283"/>
-      </w:pPr>
-      <w:rPr/>
-    </w:lvl>
-    <w:lvl w:ilvl="2">
-      <w:start w:val="1"/>
-      <w:numFmt w:val="decimal"/>
-      <w:lvlText w:val="%3."/>
-      <w:lvlJc w:val="start"/>
-      <w:pPr>
-        <w:tabs>
-          <w:tab w:val="num" w:pos="2127"/>
-        </w:tabs>
-        <w:ind w:start="2127" w:hanging="283"/>
-      </w:pPr>
-      <w:rPr/>
-    </w:lvl>
-    <w:lvl w:ilvl="3">
-      <w:start w:val="1"/>
-      <w:numFmt w:val="decimal"/>
-      <w:lvlText w:val="%4."/>
-      <w:lvlJc w:val="start"/>
-      <w:pPr>
-        <w:tabs>
-          <w:tab w:val="num" w:pos="2836"/>
-        </w:tabs>
-        <w:ind w:start="2836" w:hanging="283"/>
-      </w:pPr>
-      <w:rPr/>
-    </w:lvl>
-    <w:lvl w:ilvl="4">
-      <w:start w:val="1"/>
-      <w:numFmt w:val="decimal"/>
-      <w:lvlText w:val="%5."/>
-      <w:lvlJc w:val="start"/>
-      <w:pPr>
-        <w:tabs>
-          <w:tab w:val="num" w:pos="3545"/>
-        </w:tabs>
-        <w:ind w:start="3545" w:hanging="283"/>
-      </w:pPr>
-      <w:rPr/>
-    </w:lvl>
-    <w:lvl w:ilvl="5">
-      <w:start w:val="1"/>
-      <w:numFmt w:val="decimal"/>
-      <w:lvlText w:val="%6."/>
-      <w:lvlJc w:val="start"/>
-      <w:pPr>
-        <w:tabs>
-          <w:tab w:val="num" w:pos="4254"/>
-        </w:tabs>
-        <w:ind w:start="4254" w:hanging="283"/>
-      </w:pPr>
-      <w:rPr/>
-    </w:lvl>
-    <w:lvl w:ilvl="6">
-      <w:start w:val="1"/>
-      <w:numFmt w:val="decimal"/>
-      <w:lvlText w:val="%7."/>
-      <w:lvlJc w:val="start"/>
-      <w:pPr>
-        <w:tabs>
-          <w:tab w:val="num" w:pos="4963"/>
-        </w:tabs>
-        <w:ind w:start="4963" w:hanging="283"/>
-      </w:pPr>
-      <w:rPr/>
-    </w:lvl>
-    <w:lvl w:ilvl="7">
-      <w:start w:val="1"/>
-      <w:numFmt w:val="decimal"/>
-      <w:lvlText w:val="%8."/>
-      <w:lvlJc w:val="start"/>
-      <w:pPr>
-        <w:tabs>
-          <w:tab w:val="num" w:pos="5672"/>
-        </w:tabs>
-        <w:ind w:start="5672" w:hanging="283"/>
-      </w:pPr>
-      <w:rPr/>
-    </w:lvl>
-    <w:lvl w:ilvl="8">
-      <w:start w:val="1"/>
-      <w:numFmt w:val="decimal"/>
-      <w:lvlText w:val="%9."/>
-      <w:lvlJc w:val="start"/>
-      <w:pPr>
-        <w:tabs>
-          <w:tab w:val="num" w:pos="6381"/>
-        </w:tabs>
-        <w:ind w:start="6381" w:hanging="283"/>
-      </w:pPr>
-      <w:rPr/>
-    </w:lvl>
-  </w:abstractNum>
-  <w:abstractNum w:abstractNumId="2">
-    <w:lvl w:ilvl="0">
-      <w:start w:val="1"/>
       <w:numFmt w:val="bullet"/>
       <w:lvlText w:val=""/>
-      <w:lvlJc w:val="start"/>
-      <w:pPr>
-        <w:tabs>
-          <w:tab w:val="num" w:pos="709"/>
-        </w:tabs>
-        <w:ind w:start="709" w:hanging="283"/>
+      <w:lvlJc w:val="left"/>
+      <w:pPr>
+        <w:tabs>
+          <w:tab w:val="num" w:pos="1418"/>
+        </w:tabs>
+        <w:ind w:left="1418" w:hanging="283"/>
       </w:pPr>
       <w:rPr>
         <w:rFonts w:ascii="Symbol" w:hAnsi="Symbol" w:cs="Symbol" w:hint="default"/>
       </w:rPr>
     </w:lvl>
-    <w:lvl w:ilvl="1">
+    <w:lvl w:ilvl="2">
       <w:start w:val="1"/>
       <w:numFmt w:val="bullet"/>
       <w:lvlText w:val=""/>
-      <w:lvlJc w:val="start"/>
-      <w:pPr>
-        <w:tabs>
-          <w:tab w:val="num" w:pos="1418"/>
-        </w:tabs>
-        <w:ind w:start="1418" w:hanging="283"/>
+      <w:lvlJc w:val="left"/>
+      <w:pPr>
+        <w:tabs>
+          <w:tab w:val="num" w:pos="2127"/>
+        </w:tabs>
+        <w:ind w:left="2127" w:hanging="283"/>
       </w:pPr>
       <w:rPr>
         <w:rFonts w:ascii="Symbol" w:hAnsi="Symbol" w:cs="Symbol" w:hint="default"/>
       </w:rPr>
     </w:lvl>
-    <w:lvl w:ilvl="2">
+    <w:lvl w:ilvl="3">
       <w:start w:val="1"/>
       <w:numFmt w:val="bullet"/>
       <w:lvlText w:val=""/>
-      <w:lvlJc w:val="start"/>
-      <w:pPr>
-        <w:tabs>
-          <w:tab w:val="num" w:pos="2127"/>
-        </w:tabs>
-        <w:ind w:start="2127" w:hanging="283"/>
+      <w:lvlJc w:val="left"/>
+      <w:pPr>
+        <w:tabs>
+          <w:tab w:val="num" w:pos="2836"/>
+        </w:tabs>
+        <w:ind w:left="2836" w:hanging="283"/>
       </w:pPr>
       <w:rPr>
         <w:rFonts w:ascii="Symbol" w:hAnsi="Symbol" w:cs="Symbol" w:hint="default"/>
       </w:rPr>
     </w:lvl>
-    <w:lvl w:ilvl="3">
+    <w:lvl w:ilvl="4">
       <w:start w:val="1"/>
       <w:numFmt w:val="bullet"/>
       <w:lvlText w:val=""/>
-      <w:lvlJc w:val="start"/>
-      <w:pPr>
-        <w:tabs>
-          <w:tab w:val="num" w:pos="2836"/>
-        </w:tabs>
-        <w:ind w:start="2836" w:hanging="283"/>
+      <w:lvlJc w:val="left"/>
+      <w:pPr>
+        <w:tabs>
+          <w:tab w:val="num" w:pos="3545"/>
+        </w:tabs>
+        <w:ind w:left="3545" w:hanging="283"/>
       </w:pPr>
       <w:rPr>
         <w:rFonts w:ascii="Symbol" w:hAnsi="Symbol" w:cs="Symbol" w:hint="default"/>
       </w:rPr>
     </w:lvl>
-    <w:lvl w:ilvl="4">
+    <w:lvl w:ilvl="5">
       <w:start w:val="1"/>
       <w:numFmt w:val="bullet"/>
       <w:lvlText w:val=""/>
-      <w:lvlJc w:val="start"/>
-      <w:pPr>
-        <w:tabs>
-          <w:tab w:val="num" w:pos="3545"/>
-        </w:tabs>
-        <w:ind w:start="3545" w:hanging="283"/>
+      <w:lvlJc w:val="left"/>
+      <w:pPr>
+        <w:tabs>
+          <w:tab w:val="num" w:pos="4254"/>
+        </w:tabs>
+        <w:ind w:left="4254" w:hanging="283"/>
       </w:pPr>
       <w:rPr>
         <w:rFonts w:ascii="Symbol" w:hAnsi="Symbol" w:cs="Symbol" w:hint="default"/>
       </w:rPr>
     </w:lvl>
-    <w:lvl w:ilvl="5">
+    <w:lvl w:ilvl="6">
       <w:start w:val="1"/>
       <w:numFmt w:val="bullet"/>
       <w:lvlText w:val=""/>
-      <w:lvlJc w:val="start"/>
-      <w:pPr>
-        <w:tabs>
-          <w:tab w:val="num" w:pos="4254"/>
-        </w:tabs>
-        <w:ind w:start="4254" w:hanging="283"/>
+      <w:lvlJc w:val="left"/>
+      <w:pPr>
+        <w:tabs>
+          <w:tab w:val="num" w:pos="4963"/>
+        </w:tabs>
+        <w:ind w:left="4963" w:hanging="283"/>
       </w:pPr>
       <w:rPr>
         <w:rFonts w:ascii="Symbol" w:hAnsi="Symbol" w:cs="Symbol" w:hint="default"/>
       </w:rPr>
     </w:lvl>
-    <w:lvl w:ilvl="6">
+    <w:lvl w:ilvl="7">
       <w:start w:val="1"/>
       <w:numFmt w:val="bullet"/>
       <w:lvlText w:val=""/>
-      <w:lvlJc w:val="start"/>
-      <w:pPr>
-        <w:tabs>
-          <w:tab w:val="num" w:pos="4963"/>
-        </w:tabs>
-        <w:ind w:start="4963" w:hanging="283"/>
+      <w:lvlJc w:val="left"/>
+      <w:pPr>
+        <w:tabs>
+          <w:tab w:val="num" w:pos="5672"/>
+        </w:tabs>
+        <w:ind w:left="5672" w:hanging="283"/>
       </w:pPr>
       <w:rPr>
         <w:rFonts w:ascii="Symbol" w:hAnsi="Symbol" w:cs="Symbol" w:hint="default"/>
       </w:rPr>
     </w:lvl>
-    <w:lvl w:ilvl="7">
+    <w:lvl w:ilvl="8">
       <w:start w:val="1"/>
       <w:numFmt w:val="bullet"/>
       <w:lvlText w:val=""/>
-      <w:lvlJc w:val="start"/>
-      <w:pPr>
-        <w:tabs>
-          <w:tab w:val="num" w:pos="5672"/>
-        </w:tabs>
-        <w:ind w:start="5672" w:hanging="283"/>
+      <w:lvlJc w:val="left"/>
+      <w:pPr>
+        <w:tabs>
+          <w:tab w:val="num" w:pos="6381"/>
+        </w:tabs>
+        <w:ind w:left="6381" w:hanging="283"/>
       </w:pPr>
       <w:rPr>
         <w:rFonts w:ascii="Symbol" w:hAnsi="Symbol" w:cs="Symbol" w:hint="default"/>
       </w:rPr>
     </w:lvl>
+  </w:abstractNum>
+  <w:abstractNum w:abstractNumId="1" w15:restartNumberingAfterBreak="0">
+    <w:nsid w:val="734C76C6"/>
+    <w:multiLevelType w:val="multilevel"/>
+    <w:tmpl w:val="A7062D5A"/>
+    <w:lvl w:ilvl="0">
+      <w:start w:val="1"/>
+      <w:numFmt w:val="none"/>
+      <w:suff w:val="nothing"/>
+      <w:lvlText w:val=""/>
+      <w:lvlJc w:val="left"/>
+      <w:pPr>
+        <w:tabs>
+          <w:tab w:val="num" w:pos="0"/>
+        </w:tabs>
+        <w:ind w:left="0" w:firstLine="0"/>
+      </w:pPr>
+    </w:lvl>
+    <w:lvl w:ilvl="1">
+      <w:start w:val="1"/>
+      <w:numFmt w:val="none"/>
+      <w:suff w:val="nothing"/>
+      <w:lvlText w:val=""/>
+      <w:lvlJc w:val="left"/>
+      <w:pPr>
+        <w:tabs>
+          <w:tab w:val="num" w:pos="0"/>
+        </w:tabs>
+        <w:ind w:left="0" w:firstLine="0"/>
+      </w:pPr>
+    </w:lvl>
+    <w:lvl w:ilvl="2">
+      <w:start w:val="1"/>
+      <w:numFmt w:val="none"/>
+      <w:suff w:val="nothing"/>
+      <w:lvlText w:val=""/>
+      <w:lvlJc w:val="left"/>
+      <w:pPr>
+        <w:tabs>
+          <w:tab w:val="num" w:pos="0"/>
+        </w:tabs>
+        <w:ind w:left="0" w:firstLine="0"/>
+      </w:pPr>
+    </w:lvl>
+    <w:lvl w:ilvl="3">
+      <w:start w:val="1"/>
+      <w:numFmt w:val="none"/>
+      <w:suff w:val="nothing"/>
+      <w:lvlText w:val=""/>
+      <w:lvlJc w:val="left"/>
+      <w:pPr>
+        <w:tabs>
+          <w:tab w:val="num" w:pos="0"/>
+        </w:tabs>
+        <w:ind w:left="0" w:firstLine="0"/>
+      </w:pPr>
+    </w:lvl>
+    <w:lvl w:ilvl="4">
+      <w:start w:val="1"/>
+      <w:numFmt w:val="none"/>
+      <w:suff w:val="nothing"/>
+      <w:lvlText w:val=""/>
+      <w:lvlJc w:val="left"/>
+      <w:pPr>
+        <w:tabs>
+          <w:tab w:val="num" w:pos="0"/>
+        </w:tabs>
+        <w:ind w:left="0" w:firstLine="0"/>
+      </w:pPr>
+    </w:lvl>
+    <w:lvl w:ilvl="5">
+      <w:start w:val="1"/>
+      <w:numFmt w:val="none"/>
+      <w:suff w:val="nothing"/>
+      <w:lvlText w:val=""/>
+      <w:lvlJc w:val="left"/>
+      <w:pPr>
+        <w:tabs>
+          <w:tab w:val="num" w:pos="0"/>
+        </w:tabs>
+        <w:ind w:left="0" w:firstLine="0"/>
+      </w:pPr>
+    </w:lvl>
+    <w:lvl w:ilvl="6">
+      <w:start w:val="1"/>
+      <w:numFmt w:val="none"/>
+      <w:suff w:val="nothing"/>
+      <w:lvlText w:val=""/>
+      <w:lvlJc w:val="left"/>
+      <w:pPr>
+        <w:tabs>
+          <w:tab w:val="num" w:pos="0"/>
+        </w:tabs>
+        <w:ind w:left="0" w:firstLine="0"/>
+      </w:pPr>
+    </w:lvl>
+    <w:lvl w:ilvl="7">
+      <w:start w:val="1"/>
+      <w:numFmt w:val="none"/>
+      <w:suff w:val="nothing"/>
+      <w:lvlText w:val=""/>
+      <w:lvlJc w:val="left"/>
+      <w:pPr>
+        <w:tabs>
+          <w:tab w:val="num" w:pos="0"/>
+        </w:tabs>
+        <w:ind w:left="0" w:firstLine="0"/>
+      </w:pPr>
+    </w:lvl>
     <w:lvl w:ilvl="8">
+      <w:start w:val="1"/>
+      <w:numFmt w:val="none"/>
+      <w:suff w:val="nothing"/>
+      <w:lvlText w:val=""/>
+      <w:lvlJc w:val="left"/>
+      <w:pPr>
+        <w:tabs>
+          <w:tab w:val="num" w:pos="0"/>
+        </w:tabs>
+        <w:ind w:left="0" w:firstLine="0"/>
+      </w:pPr>
+    </w:lvl>
+  </w:abstractNum>
+  <w:abstractNum w:abstractNumId="2" w15:restartNumberingAfterBreak="0">
+    <w:nsid w:val="749300C9"/>
+    <w:multiLevelType w:val="multilevel"/>
+    <w:tmpl w:val="09BAA734"/>
+    <w:lvl w:ilvl="0">
       <w:start w:val="1"/>
       <w:numFmt w:val="bullet"/>
       <w:lvlText w:val=""/>
-      <w:lvlJc w:val="start"/>
-      <w:pPr>
-        <w:tabs>
-          <w:tab w:val="num" w:pos="6381"/>
-        </w:tabs>
-        <w:ind w:start="6381" w:hanging="283"/>
+      <w:lvlJc w:val="left"/>
+      <w:pPr>
+        <w:tabs>
+          <w:tab w:val="num" w:pos="709"/>
+        </w:tabs>
+        <w:ind w:left="709" w:hanging="283"/>
       </w:pPr>
       <w:rPr>
         <w:rFonts w:ascii="Symbol" w:hAnsi="Symbol" w:cs="Symbol" w:hint="default"/>
       </w:rPr>
     </w:lvl>
+    <w:lvl w:ilvl="1">
+      <w:start w:val="1"/>
+      <w:numFmt w:val="decimal"/>
+      <w:lvlText w:val="%2."/>
+      <w:lvlJc w:val="left"/>
+      <w:pPr>
+        <w:tabs>
+          <w:tab w:val="num" w:pos="1418"/>
+        </w:tabs>
+        <w:ind w:left="1418" w:hanging="283"/>
+      </w:pPr>
+    </w:lvl>
+    <w:lvl w:ilvl="2">
+      <w:start w:val="1"/>
+      <w:numFmt w:val="decimal"/>
+      <w:lvlText w:val="%3."/>
+      <w:lvlJc w:val="left"/>
+      <w:pPr>
+        <w:tabs>
+          <w:tab w:val="num" w:pos="2127"/>
+        </w:tabs>
+        <w:ind w:left="2127" w:hanging="283"/>
+      </w:pPr>
+    </w:lvl>
+    <w:lvl w:ilvl="3">
+      <w:start w:val="1"/>
+      <w:numFmt w:val="decimal"/>
+      <w:lvlText w:val="%4."/>
+      <w:lvlJc w:val="left"/>
+      <w:pPr>
+        <w:tabs>
+          <w:tab w:val="num" w:pos="2836"/>
+        </w:tabs>
+        <w:ind w:left="2836" w:hanging="283"/>
+      </w:pPr>
+    </w:lvl>
+    <w:lvl w:ilvl="4">
+      <w:start w:val="1"/>
+      <w:numFmt w:val="decimal"/>
+      <w:lvlText w:val="%5."/>
+      <w:lvlJc w:val="left"/>
+      <w:pPr>
+        <w:tabs>
+          <w:tab w:val="num" w:pos="3545"/>
+        </w:tabs>
+        <w:ind w:left="3545" w:hanging="283"/>
+      </w:pPr>
+    </w:lvl>
+    <w:lvl w:ilvl="5">
+      <w:start w:val="1"/>
+      <w:numFmt w:val="decimal"/>
+      <w:lvlText w:val="%6."/>
+      <w:lvlJc w:val="left"/>
+      <w:pPr>
+        <w:tabs>
+          <w:tab w:val="num" w:pos="4254"/>
+        </w:tabs>
+        <w:ind w:left="4254" w:hanging="283"/>
+      </w:pPr>
+    </w:lvl>
+    <w:lvl w:ilvl="6">
+      <w:start w:val="1"/>
+      <w:numFmt w:val="decimal"/>
+      <w:lvlText w:val="%7."/>
+      <w:lvlJc w:val="left"/>
+      <w:pPr>
+        <w:tabs>
+          <w:tab w:val="num" w:pos="4963"/>
+        </w:tabs>
+        <w:ind w:left="4963" w:hanging="283"/>
+      </w:pPr>
+    </w:lvl>
+    <w:lvl w:ilvl="7">
+      <w:start w:val="1"/>
+      <w:numFmt w:val="decimal"/>
+      <w:lvlText w:val="%8."/>
+      <w:lvlJc w:val="left"/>
+      <w:pPr>
+        <w:tabs>
+          <w:tab w:val="num" w:pos="5672"/>
+        </w:tabs>
+        <w:ind w:left="5672" w:hanging="283"/>
+      </w:pPr>
+    </w:lvl>
+    <w:lvl w:ilvl="8">
+      <w:start w:val="1"/>
+      <w:numFmt w:val="decimal"/>
+      <w:lvlText w:val="%9."/>
+      <w:lvlJc w:val="left"/>
+      <w:pPr>
+        <w:tabs>
+          <w:tab w:val="num" w:pos="6381"/>
+        </w:tabs>
+        <w:ind w:left="6381" w:hanging="283"/>
+      </w:pPr>
+    </w:lvl>
   </w:abstractNum>
-  <w:abstractNum w:abstractNumId="3">
+  <w:abstractNum w:abstractNumId="3" w15:restartNumberingAfterBreak="0">
+    <w:nsid w:val="75B8581B"/>
+    <w:multiLevelType w:val="multilevel"/>
+    <w:tmpl w:val="96B62910"/>
     <w:lvl w:ilvl="0">
       <w:start w:val="1"/>
       <w:numFmt w:val="bullet"/>
       <w:lvlText w:val=""/>
-      <w:lvlJc w:val="start"/>
+      <w:lvlJc w:val="left"/>
       <w:pPr>
         <w:tabs>
           <w:tab w:val="num" w:pos="709"/>
         </w:tabs>
-        <w:ind w:start="709" w:hanging="283"/>
+        <w:ind w:left="709" w:hanging="283"/>
       </w:pPr>
       <w:rPr>
         <w:rFonts w:ascii="Symbol" w:hAnsi="Symbol" w:cs="Symbol" w:hint="default"/>
@@ -2022,12 +2190,12 @@
       <w:start w:val="1"/>
       <w:numFmt w:val="bullet"/>
       <w:lvlText w:val=""/>
-      <w:lvlJc w:val="start"/>
+      <w:lvlJc w:val="left"/>
       <w:pPr>
         <w:tabs>
           <w:tab w:val="num" w:pos="1418"/>
         </w:tabs>
-        <w:ind w:start="1418" w:hanging="283"/>
+        <w:ind w:left="1418" w:hanging="283"/>
       </w:pPr>
       <w:rPr>
         <w:rFonts w:ascii="Symbol" w:hAnsi="Symbol" w:cs="Symbol" w:hint="default"/>
@@ -2037,12 +2205,12 @@
       <w:start w:val="1"/>
       <w:numFmt w:val="bullet"/>
       <w:lvlText w:val=""/>
-      <w:lvlJc w:val="start"/>
+      <w:lvlJc w:val="left"/>
       <w:pPr>
         <w:tabs>
           <w:tab w:val="num" w:pos="2127"/>
         </w:tabs>
-        <w:ind w:start="2127" w:hanging="283"/>
+        <w:ind w:left="2127" w:hanging="283"/>
       </w:pPr>
       <w:rPr>
         <w:rFonts w:ascii="Symbol" w:hAnsi="Symbol" w:cs="Symbol" w:hint="default"/>
@@ -2052,12 +2220,12 @@
       <w:start w:val="1"/>
       <w:numFmt w:val="bullet"/>
       <w:lvlText w:val=""/>
-      <w:lvlJc w:val="start"/>
+      <w:lvlJc w:val="left"/>
       <w:pPr>
         <w:tabs>
           <w:tab w:val="num" w:pos="2836"/>
         </w:tabs>
-        <w:ind w:start="2836" w:hanging="283"/>
+        <w:ind w:left="2836" w:hanging="283"/>
       </w:pPr>
       <w:rPr>
         <w:rFonts w:ascii="Symbol" w:hAnsi="Symbol" w:cs="Symbol" w:hint="default"/>
@@ -2067,12 +2235,12 @@
       <w:start w:val="1"/>
       <w:numFmt w:val="bullet"/>
       <w:lvlText w:val=""/>
-      <w:lvlJc w:val="start"/>
+      <w:lvlJc w:val="left"/>
       <w:pPr>
         <w:tabs>
           <w:tab w:val="num" w:pos="3545"/>
         </w:tabs>
-        <w:ind w:start="3545" w:hanging="283"/>
+        <w:ind w:left="3545" w:hanging="283"/>
       </w:pPr>
       <w:rPr>
         <w:rFonts w:ascii="Symbol" w:hAnsi="Symbol" w:cs="Symbol" w:hint="default"/>
@@ -2082,12 +2250,12 @@
       <w:start w:val="1"/>
       <w:numFmt w:val="bullet"/>
       <w:lvlText w:val=""/>
-      <w:lvlJc w:val="start"/>
+      <w:lvlJc w:val="left"/>
       <w:pPr>
         <w:tabs>
           <w:tab w:val="num" w:pos="4254"/>
         </w:tabs>
-        <w:ind w:start="4254" w:hanging="283"/>
+        <w:ind w:left="4254" w:hanging="283"/>
       </w:pPr>
       <w:rPr>
         <w:rFonts w:ascii="Symbol" w:hAnsi="Symbol" w:cs="Symbol" w:hint="default"/>
@@ -2097,12 +2265,12 @@
       <w:start w:val="1"/>
       <w:numFmt w:val="bullet"/>
       <w:lvlText w:val=""/>
-      <w:lvlJc w:val="start"/>
+      <w:lvlJc w:val="left"/>
       <w:pPr>
         <w:tabs>
           <w:tab w:val="num" w:pos="4963"/>
         </w:tabs>
-        <w:ind w:start="4963" w:hanging="283"/>
+        <w:ind w:left="4963" w:hanging="283"/>
       </w:pPr>
       <w:rPr>
         <w:rFonts w:ascii="Symbol" w:hAnsi="Symbol" w:cs="Symbol" w:hint="default"/>
@@ -2112,12 +2280,12 @@
       <w:start w:val="1"/>
       <w:numFmt w:val="bullet"/>
       <w:lvlText w:val=""/>
-      <w:lvlJc w:val="start"/>
+      <w:lvlJc w:val="left"/>
       <w:pPr>
         <w:tabs>
           <w:tab w:val="num" w:pos="5672"/>
         </w:tabs>
-        <w:ind w:start="5672" w:hanging="283"/>
+        <w:ind w:left="5672" w:hanging="283"/>
       </w:pPr>
       <w:rPr>
         <w:rFonts w:ascii="Symbol" w:hAnsi="Symbol" w:cs="Symbol" w:hint="default"/>
@@ -2127,29 +2295,32 @@
       <w:start w:val="1"/>
       <w:numFmt w:val="bullet"/>
       <w:lvlText w:val=""/>
-      <w:lvlJc w:val="start"/>
+      <w:lvlJc w:val="left"/>
       <w:pPr>
         <w:tabs>
           <w:tab w:val="num" w:pos="6381"/>
         </w:tabs>
-        <w:ind w:start="6381" w:hanging="283"/>
+        <w:ind w:left="6381" w:hanging="283"/>
       </w:pPr>
       <w:rPr>
         <w:rFonts w:ascii="Symbol" w:hAnsi="Symbol" w:cs="Symbol" w:hint="default"/>
       </w:rPr>
     </w:lvl>
   </w:abstractNum>
-  <w:abstractNum w:abstractNumId="4">
+  <w:abstractNum w:abstractNumId="4" w15:restartNumberingAfterBreak="0">
+    <w:nsid w:val="7C68691B"/>
+    <w:multiLevelType w:val="multilevel"/>
+    <w:tmpl w:val="1A325F94"/>
     <w:lvl w:ilvl="0">
       <w:start w:val="1"/>
       <w:numFmt w:val="bullet"/>
       <w:lvlText w:val=""/>
-      <w:lvlJc w:val="start"/>
+      <w:lvlJc w:val="left"/>
       <w:pPr>
         <w:tabs>
           <w:tab w:val="num" w:pos="709"/>
         </w:tabs>
-        <w:ind w:start="709" w:hanging="283"/>
+        <w:ind w:left="709" w:hanging="283"/>
       </w:pPr>
       <w:rPr>
         <w:rFonts w:ascii="Symbol" w:hAnsi="Symbol" w:cs="Symbol" w:hint="default"/>
@@ -2159,12 +2330,12 @@
       <w:start w:val="1"/>
       <w:numFmt w:val="bullet"/>
       <w:lvlText w:val=""/>
-      <w:lvlJc w:val="start"/>
+      <w:lvlJc w:val="left"/>
       <w:pPr>
         <w:tabs>
           <w:tab w:val="num" w:pos="1418"/>
         </w:tabs>
-        <w:ind w:start="1418" w:hanging="283"/>
+        <w:ind w:left="1418" w:hanging="283"/>
       </w:pPr>
       <w:rPr>
         <w:rFonts w:ascii="Symbol" w:hAnsi="Symbol" w:cs="Symbol" w:hint="default"/>
@@ -2174,12 +2345,12 @@
       <w:start w:val="1"/>
       <w:numFmt w:val="bullet"/>
       <w:lvlText w:val=""/>
-      <w:lvlJc w:val="start"/>
+      <w:lvlJc w:val="left"/>
       <w:pPr>
         <w:tabs>
           <w:tab w:val="num" w:pos="2127"/>
         </w:tabs>
-        <w:ind w:start="2127" w:hanging="283"/>
+        <w:ind w:left="2127" w:hanging="283"/>
       </w:pPr>
       <w:rPr>
         <w:rFonts w:ascii="Symbol" w:hAnsi="Symbol" w:cs="Symbol" w:hint="default"/>
@@ -2189,12 +2360,12 @@
       <w:start w:val="1"/>
       <w:numFmt w:val="bullet"/>
       <w:lvlText w:val=""/>
-      <w:lvlJc w:val="start"/>
+      <w:lvlJc w:val="left"/>
       <w:pPr>
         <w:tabs>
           <w:tab w:val="num" w:pos="2836"/>
         </w:tabs>
-        <w:ind w:start="2836" w:hanging="283"/>
+        <w:ind w:left="2836" w:hanging="283"/>
       </w:pPr>
       <w:rPr>
         <w:rFonts w:ascii="Symbol" w:hAnsi="Symbol" w:cs="Symbol" w:hint="default"/>
@@ -2204,12 +2375,12 @@
       <w:start w:val="1"/>
       <w:numFmt w:val="bullet"/>
       <w:lvlText w:val=""/>
-      <w:lvlJc w:val="start"/>
+      <w:lvlJc w:val="left"/>
       <w:pPr>
         <w:tabs>
           <w:tab w:val="num" w:pos="3545"/>
         </w:tabs>
-        <w:ind w:start="3545" w:hanging="283"/>
+        <w:ind w:left="3545" w:hanging="283"/>
       </w:pPr>
       <w:rPr>
         <w:rFonts w:ascii="Symbol" w:hAnsi="Symbol" w:cs="Symbol" w:hint="default"/>
@@ -2219,12 +2390,12 @@
       <w:start w:val="1"/>
       <w:numFmt w:val="bullet"/>
       <w:lvlText w:val=""/>
-      <w:lvlJc w:val="start"/>
+      <w:lvlJc w:val="left"/>
       <w:pPr>
         <w:tabs>
           <w:tab w:val="num" w:pos="4254"/>
         </w:tabs>
-        <w:ind w:start="4254" w:hanging="283"/>
+        <w:ind w:left="4254" w:hanging="283"/>
       </w:pPr>
       <w:rPr>
         <w:rFonts w:ascii="Symbol" w:hAnsi="Symbol" w:cs="Symbol" w:hint="default"/>
@@ -2234,12 +2405,12 @@
       <w:start w:val="1"/>
       <w:numFmt w:val="bullet"/>
       <w:lvlText w:val=""/>
-      <w:lvlJc w:val="start"/>
+      <w:lvlJc w:val="left"/>
       <w:pPr>
         <w:tabs>
           <w:tab w:val="num" w:pos="4963"/>
         </w:tabs>
-        <w:ind w:start="4963" w:hanging="283"/>
+        <w:ind w:left="4963" w:hanging="283"/>
       </w:pPr>
       <w:rPr>
         <w:rFonts w:ascii="Symbol" w:hAnsi="Symbol" w:cs="Symbol" w:hint="default"/>
@@ -2249,12 +2420,12 @@
       <w:start w:val="1"/>
       <w:numFmt w:val="bullet"/>
       <w:lvlText w:val=""/>
-      <w:lvlJc w:val="start"/>
+      <w:lvlJc w:val="left"/>
       <w:pPr>
         <w:tabs>
           <w:tab w:val="num" w:pos="5672"/>
         </w:tabs>
-        <w:ind w:start="5672" w:hanging="283"/>
+        <w:ind w:left="5672" w:hanging="283"/>
       </w:pPr>
       <w:rPr>
         <w:rFonts w:ascii="Symbol" w:hAnsi="Symbol" w:cs="Symbol" w:hint="default"/>
@@ -2264,163 +2435,42 @@
       <w:start w:val="1"/>
       <w:numFmt w:val="bullet"/>
       <w:lvlText w:val=""/>
-      <w:lvlJc w:val="start"/>
+      <w:lvlJc w:val="left"/>
       <w:pPr>
         <w:tabs>
           <w:tab w:val="num" w:pos="6381"/>
         </w:tabs>
-        <w:ind w:start="6381" w:hanging="283"/>
+        <w:ind w:left="6381" w:hanging="283"/>
       </w:pPr>
       <w:rPr>
         <w:rFonts w:ascii="Symbol" w:hAnsi="Symbol" w:cs="Symbol" w:hint="default"/>
       </w:rPr>
     </w:lvl>
   </w:abstractNum>
-  <w:abstractNum w:abstractNumId="5">
-    <w:lvl w:ilvl="0">
-      <w:start w:val="1"/>
-      <w:numFmt w:val="none"/>
-      <w:suff w:val="nothing"/>
-      <w:lvlText w:val=""/>
-      <w:lvlJc w:val="start"/>
-      <w:pPr>
-        <w:tabs>
-          <w:tab w:val="num" w:pos="0"/>
-        </w:tabs>
-        <w:ind w:start="0" w:hanging="0"/>
-      </w:pPr>
-    </w:lvl>
-    <w:lvl w:ilvl="1">
-      <w:start w:val="1"/>
-      <w:pStyle w:val="Heading2"/>
-      <w:numFmt w:val="none"/>
-      <w:suff w:val="nothing"/>
-      <w:lvlText w:val=""/>
-      <w:lvlJc w:val="start"/>
-      <w:pPr>
-        <w:tabs>
-          <w:tab w:val="num" w:pos="0"/>
-        </w:tabs>
-        <w:ind w:start="0" w:hanging="0"/>
-      </w:pPr>
-    </w:lvl>
-    <w:lvl w:ilvl="2">
-      <w:start w:val="1"/>
-      <w:pStyle w:val="Heading3"/>
-      <w:numFmt w:val="none"/>
-      <w:suff w:val="nothing"/>
-      <w:lvlText w:val=""/>
-      <w:lvlJc w:val="start"/>
-      <w:pPr>
-        <w:tabs>
-          <w:tab w:val="num" w:pos="0"/>
-        </w:tabs>
-        <w:ind w:start="0" w:hanging="0"/>
-      </w:pPr>
-    </w:lvl>
-    <w:lvl w:ilvl="3">
-      <w:start w:val="1"/>
-      <w:numFmt w:val="none"/>
-      <w:suff w:val="nothing"/>
-      <w:lvlText w:val=""/>
-      <w:lvlJc w:val="start"/>
-      <w:pPr>
-        <w:tabs>
-          <w:tab w:val="num" w:pos="0"/>
-        </w:tabs>
-        <w:ind w:start="0" w:hanging="0"/>
-      </w:pPr>
-    </w:lvl>
-    <w:lvl w:ilvl="4">
-      <w:start w:val="1"/>
-      <w:numFmt w:val="none"/>
-      <w:suff w:val="nothing"/>
-      <w:lvlText w:val=""/>
-      <w:lvlJc w:val="start"/>
-      <w:pPr>
-        <w:tabs>
-          <w:tab w:val="num" w:pos="0"/>
-        </w:tabs>
-        <w:ind w:start="0" w:hanging="0"/>
-      </w:pPr>
-    </w:lvl>
-    <w:lvl w:ilvl="5">
-      <w:start w:val="1"/>
-      <w:numFmt w:val="none"/>
-      <w:suff w:val="nothing"/>
-      <w:lvlText w:val=""/>
-      <w:lvlJc w:val="start"/>
-      <w:pPr>
-        <w:tabs>
-          <w:tab w:val="num" w:pos="0"/>
-        </w:tabs>
-        <w:ind w:start="0" w:hanging="0"/>
-      </w:pPr>
-    </w:lvl>
-    <w:lvl w:ilvl="6">
-      <w:start w:val="1"/>
-      <w:numFmt w:val="none"/>
-      <w:suff w:val="nothing"/>
-      <w:lvlText w:val=""/>
-      <w:lvlJc w:val="start"/>
-      <w:pPr>
-        <w:tabs>
-          <w:tab w:val="num" w:pos="0"/>
-        </w:tabs>
-        <w:ind w:start="0" w:hanging="0"/>
-      </w:pPr>
-    </w:lvl>
-    <w:lvl w:ilvl="7">
-      <w:start w:val="1"/>
-      <w:numFmt w:val="none"/>
-      <w:suff w:val="nothing"/>
-      <w:lvlText w:val=""/>
-      <w:lvlJc w:val="start"/>
-      <w:pPr>
-        <w:tabs>
-          <w:tab w:val="num" w:pos="0"/>
-        </w:tabs>
-        <w:ind w:start="0" w:hanging="0"/>
-      </w:pPr>
-    </w:lvl>
-    <w:lvl w:ilvl="8">
-      <w:start w:val="1"/>
-      <w:numFmt w:val="none"/>
-      <w:suff w:val="nothing"/>
-      <w:lvlText w:val=""/>
-      <w:lvlJc w:val="start"/>
-      <w:pPr>
-        <w:tabs>
-          <w:tab w:val="num" w:pos="0"/>
-        </w:tabs>
-        <w:ind w:start="0" w:hanging="0"/>
-      </w:pPr>
-    </w:lvl>
-  </w:abstractNum>
-  <w:num w:numId="1">
-    <w:abstractNumId w:val="1"/>
-  </w:num>
-  <w:num w:numId="2">
+  <w:num w:numId="1" w16cid:durableId="741683690">
     <w:abstractNumId w:val="2"/>
   </w:num>
-  <w:num w:numId="3">
+  <w:num w:numId="2" w16cid:durableId="1267151371">
+    <w:abstractNumId w:val="4"/>
+  </w:num>
+  <w:num w:numId="3" w16cid:durableId="1423406919">
+    <w:abstractNumId w:val="0"/>
+  </w:num>
+  <w:num w:numId="4" w16cid:durableId="1835146514">
     <w:abstractNumId w:val="3"/>
   </w:num>
-  <w:num w:numId="4">
-    <w:abstractNumId w:val="4"/>
-  </w:num>
-  <w:num w:numId="5">
-    <w:abstractNumId w:val="5"/>
+  <w:num w:numId="5" w16cid:durableId="101195187">
+    <w:abstractNumId w:val="1"/>
   </w:num>
 </w:numbering>
 </file>
 
 <file path=word/styles.xml><?xml version="1.0" encoding="utf-8"?>
-<w:styles xmlns:w="http://schemas.openxmlformats.org/wordprocessingml/2006/main" xmlns:w14="http://schemas.microsoft.com/office/word/2010/wordml" xmlns:mc="http://schemas.openxmlformats.org/markup-compatibility/2006" mc:Ignorable="w14">
+<w:styles xmlns:mc="http://schemas.openxmlformats.org/markup-compatibility/2006" xmlns:r="http://schemas.openxmlformats.org/officeDocument/2006/relationships" xmlns:w="http://schemas.openxmlformats.org/wordprocessingml/2006/main" xmlns:w14="http://schemas.microsoft.com/office/word/2010/wordml" xmlns:w15="http://schemas.microsoft.com/office/word/2012/wordml" xmlns:w16cex="http://schemas.microsoft.com/office/word/2018/wordml/cex" xmlns:w16cid="http://schemas.microsoft.com/office/word/2016/wordml/cid" xmlns:w16="http://schemas.microsoft.com/office/word/2018/wordml" xmlns:w16du="http://schemas.microsoft.com/office/word/2023/wordml/word16du" xmlns:w16sdtdh="http://schemas.microsoft.com/office/word/2020/wordml/sdtdatahash" xmlns:w16sdtfl="http://schemas.microsoft.com/office/word/2024/wordml/sdtformatlock" xmlns:w16se="http://schemas.microsoft.com/office/word/2015/wordml/symex" mc:Ignorable="w14 w15 w16se w16cid w16 w16cex w16sdtdh w16sdtfl w16du">
   <w:docDefaults>
     <w:rPrDefault>
       <w:rPr>
-        <w:rFonts w:ascii="Liberation Serif" w:hAnsi="Liberation Serif" w:eastAsia="NSimSun" w:cs="Lucida Sans"/>
+        <w:rFonts w:ascii="Liberation Serif" w:eastAsia="NSimSun" w:hAnsi="Liberation Serif" w:cs="Lucida Sans"/>
         <w:kern w:val="2"/>
         <w:sz w:val="24"/>
         <w:szCs w:val="24"/>
@@ -2429,81 +2479,474 @@
     </w:rPrDefault>
     <w:pPrDefault>
       <w:pPr>
-        <w:widowControl/>
-        <w:suppressAutoHyphens w:val="true"/>
+        <w:suppressAutoHyphens/>
       </w:pPr>
     </w:pPrDefault>
   </w:docDefaults>
-  <w:style w:type="paragraph" w:styleId="Normal">
+  <w:latentStyles w:defLockedState="0" w:defUIPriority="99" w:defSemiHidden="0" w:defUnhideWhenUsed="0" w:defQFormat="0" w:count="376">
+    <w:lsdException w:name="Normal" w:uiPriority="0" w:qFormat="1"/>
+    <w:lsdException w:name="heading 1" w:uiPriority="9" w:qFormat="1"/>
+    <w:lsdException w:name="heading 2" w:semiHidden="1" w:uiPriority="9" w:unhideWhenUsed="1" w:qFormat="1"/>
+    <w:lsdException w:name="heading 3" w:semiHidden="1" w:uiPriority="9" w:unhideWhenUsed="1" w:qFormat="1"/>
+    <w:lsdException w:name="heading 4" w:semiHidden="1" w:uiPriority="9" w:unhideWhenUsed="1" w:qFormat="1"/>
+    <w:lsdException w:name="heading 5" w:semiHidden="1" w:uiPriority="9" w:unhideWhenUsed="1" w:qFormat="1"/>
+    <w:lsdException w:name="heading 6" w:semiHidden="1" w:uiPriority="9" w:unhideWhenUsed="1" w:qFormat="1"/>
+    <w:lsdException w:name="heading 7" w:semiHidden="1" w:uiPriority="9" w:unhideWhenUsed="1" w:qFormat="1"/>
+    <w:lsdException w:name="heading 8" w:semiHidden="1" w:uiPriority="9" w:unhideWhenUsed="1" w:qFormat="1"/>
+    <w:lsdException w:name="heading 9" w:semiHidden="1" w:uiPriority="9" w:unhideWhenUsed="1" w:qFormat="1"/>
+    <w:lsdException w:name="index 1" w:semiHidden="1" w:unhideWhenUsed="1"/>
+    <w:lsdException w:name="index 2" w:semiHidden="1" w:unhideWhenUsed="1"/>
+    <w:lsdException w:name="index 3" w:semiHidden="1" w:unhideWhenUsed="1"/>
+    <w:lsdException w:name="index 4" w:semiHidden="1" w:unhideWhenUsed="1"/>
+    <w:lsdException w:name="index 5" w:semiHidden="1" w:unhideWhenUsed="1"/>
+    <w:lsdException w:name="index 6" w:semiHidden="1" w:unhideWhenUsed="1"/>
+    <w:lsdException w:name="index 7" w:semiHidden="1" w:unhideWhenUsed="1"/>
+    <w:lsdException w:name="index 8" w:semiHidden="1" w:unhideWhenUsed="1"/>
+    <w:lsdException w:name="index 9" w:semiHidden="1" w:unhideWhenUsed="1"/>
+    <w:lsdException w:name="toc 1" w:semiHidden="1" w:uiPriority="39" w:unhideWhenUsed="1"/>
+    <w:lsdException w:name="toc 2" w:semiHidden="1" w:uiPriority="39" w:unhideWhenUsed="1"/>
+    <w:lsdException w:name="toc 3" w:semiHidden="1" w:uiPriority="39" w:unhideWhenUsed="1"/>
+    <w:lsdException w:name="toc 4" w:semiHidden="1" w:uiPriority="39" w:unhideWhenUsed="1"/>
+    <w:lsdException w:name="toc 5" w:semiHidden="1" w:uiPriority="39" w:unhideWhenUsed="1"/>
+    <w:lsdException w:name="toc 6" w:semiHidden="1" w:uiPriority="39" w:unhideWhenUsed="1"/>
+    <w:lsdException w:name="toc 7" w:semiHidden="1" w:uiPriority="39" w:unhideWhenUsed="1"/>
+    <w:lsdException w:name="toc 8" w:semiHidden="1" w:uiPriority="39" w:unhideWhenUsed="1"/>
+    <w:lsdException w:name="toc 9" w:semiHidden="1" w:uiPriority="39" w:unhideWhenUsed="1"/>
+    <w:lsdException w:name="Normal Indent" w:semiHidden="1" w:unhideWhenUsed="1"/>
+    <w:lsdException w:name="footnote text" w:semiHidden="1" w:unhideWhenUsed="1"/>
+    <w:lsdException w:name="annotation text" w:semiHidden="1" w:unhideWhenUsed="1"/>
+    <w:lsdException w:name="header" w:semiHidden="1" w:unhideWhenUsed="1"/>
+    <w:lsdException w:name="footer" w:semiHidden="1" w:unhideWhenUsed="1"/>
+    <w:lsdException w:name="index heading" w:semiHidden="1" w:unhideWhenUsed="1"/>
+    <w:lsdException w:name="caption" w:semiHidden="1" w:uiPriority="35" w:unhideWhenUsed="1" w:qFormat="1"/>
+    <w:lsdException w:name="table of figures" w:semiHidden="1" w:unhideWhenUsed="1"/>
+    <w:lsdException w:name="envelope address" w:semiHidden="1" w:unhideWhenUsed="1"/>
+    <w:lsdException w:name="envelope return" w:semiHidden="1" w:unhideWhenUsed="1"/>
+    <w:lsdException w:name="footnote reference" w:semiHidden="1" w:unhideWhenUsed="1"/>
+    <w:lsdException w:name="annotation reference" w:semiHidden="1" w:unhideWhenUsed="1"/>
+    <w:lsdException w:name="line number" w:semiHidden="1" w:unhideWhenUsed="1"/>
+    <w:lsdException w:name="page number" w:semiHidden="1" w:unhideWhenUsed="1"/>
+    <w:lsdException w:name="endnote reference" w:semiHidden="1" w:unhideWhenUsed="1"/>
+    <w:lsdException w:name="endnote text" w:semiHidden="1" w:unhideWhenUsed="1"/>
+    <w:lsdException w:name="table of authorities" w:semiHidden="1" w:unhideWhenUsed="1"/>
+    <w:lsdException w:name="macro" w:semiHidden="1" w:unhideWhenUsed="1"/>
+    <w:lsdException w:name="toa heading" w:semiHidden="1" w:unhideWhenUsed="1"/>
+    <w:lsdException w:name="List" w:semiHidden="1" w:unhideWhenUsed="1"/>
+    <w:lsdException w:name="List Bullet" w:semiHidden="1" w:unhideWhenUsed="1"/>
+    <w:lsdException w:name="List Number" w:semiHidden="1" w:unhideWhenUsed="1"/>
+    <w:lsdException w:name="List 2" w:semiHidden="1" w:unhideWhenUsed="1"/>
+    <w:lsdException w:name="List 3" w:semiHidden="1" w:unhideWhenUsed="1"/>
+    <w:lsdException w:name="List 4" w:semiHidden="1" w:unhideWhenUsed="1"/>
+    <w:lsdException w:name="List 5" w:semiHidden="1" w:unhideWhenUsed="1"/>
+    <w:lsdException w:name="List Bullet 2" w:semiHidden="1" w:unhideWhenUsed="1"/>
+    <w:lsdException w:name="List Bullet 3" w:semiHidden="1" w:unhideWhenUsed="1"/>
+    <w:lsdException w:name="List Bullet 4" w:semiHidden="1" w:unhideWhenUsed="1"/>
+    <w:lsdException w:name="List Bullet 5" w:semiHidden="1" w:unhideWhenUsed="1"/>
+    <w:lsdException w:name="List Number 2" w:semiHidden="1" w:unhideWhenUsed="1"/>
+    <w:lsdException w:name="List Number 3" w:semiHidden="1" w:unhideWhenUsed="1"/>
+    <w:lsdException w:name="List Number 4" w:semiHidden="1" w:unhideWhenUsed="1"/>
+    <w:lsdException w:name="List Number 5" w:semiHidden="1" w:unhideWhenUsed="1"/>
+    <w:lsdException w:name="Title" w:uiPriority="10" w:qFormat="1"/>
+    <w:lsdException w:name="Closing" w:semiHidden="1" w:unhideWhenUsed="1"/>
+    <w:lsdException w:name="Signature" w:semiHidden="1" w:unhideWhenUsed="1"/>
+    <w:lsdException w:name="Default Paragraph Font" w:semiHidden="1" w:uiPriority="1" w:unhideWhenUsed="1"/>
+    <w:lsdException w:name="Body Text" w:semiHidden="1" w:unhideWhenUsed="1"/>
+    <w:lsdException w:name="Body Text Indent" w:semiHidden="1" w:unhideWhenUsed="1"/>
+    <w:lsdException w:name="List Continue" w:semiHidden="1" w:unhideWhenUsed="1"/>
+    <w:lsdException w:name="List Continue 2" w:semiHidden="1" w:unhideWhenUsed="1"/>
+    <w:lsdException w:name="List Continue 3" w:semiHidden="1" w:unhideWhenUsed="1"/>
+    <w:lsdException w:name="List Continue 4" w:semiHidden="1" w:unhideWhenUsed="1"/>
+    <w:lsdException w:name="List Continue 5" w:semiHidden="1" w:unhideWhenUsed="1"/>
+    <w:lsdException w:name="Message Header" w:semiHidden="1" w:unhideWhenUsed="1"/>
+    <w:lsdException w:name="Subtitle" w:uiPriority="11" w:qFormat="1"/>
+    <w:lsdException w:name="Salutation" w:semiHidden="1" w:unhideWhenUsed="1"/>
+    <w:lsdException w:name="Date" w:semiHidden="1" w:unhideWhenUsed="1"/>
+    <w:lsdException w:name="Body Text First Indent" w:semiHidden="1" w:unhideWhenUsed="1"/>
+    <w:lsdException w:name="Body Text First Indent 2" w:semiHidden="1" w:unhideWhenUsed="1"/>
+    <w:lsdException w:name="Note Heading" w:semiHidden="1" w:unhideWhenUsed="1"/>
+    <w:lsdException w:name="Body Text 2" w:semiHidden="1" w:unhideWhenUsed="1"/>
+    <w:lsdException w:name="Body Text 3" w:semiHidden="1" w:unhideWhenUsed="1"/>
+    <w:lsdException w:name="Body Text Indent 2" w:semiHidden="1" w:unhideWhenUsed="1"/>
+    <w:lsdException w:name="Body Text Indent 3" w:semiHidden="1" w:unhideWhenUsed="1"/>
+    <w:lsdException w:name="Block Text" w:semiHidden="1" w:unhideWhenUsed="1"/>
+    <w:lsdException w:name="Hyperlink" w:semiHidden="1" w:unhideWhenUsed="1"/>
+    <w:lsdException w:name="FollowedHyperlink" w:semiHidden="1" w:unhideWhenUsed="1"/>
+    <w:lsdException w:name="Strong" w:uiPriority="22" w:qFormat="1"/>
+    <w:lsdException w:name="Emphasis" w:uiPriority="20" w:qFormat="1"/>
+    <w:lsdException w:name="Document Map" w:semiHidden="1" w:unhideWhenUsed="1"/>
+    <w:lsdException w:name="Plain Text" w:semiHidden="1" w:unhideWhenUsed="1"/>
+    <w:lsdException w:name="E-mail Signature" w:semiHidden="1" w:unhideWhenUsed="1"/>
+    <w:lsdException w:name="HTML Top of Form" w:semiHidden="1" w:unhideWhenUsed="1"/>
+    <w:lsdException w:name="HTML Bottom of Form" w:semiHidden="1" w:unhideWhenUsed="1"/>
+    <w:lsdException w:name="Normal (Web)" w:semiHidden="1" w:unhideWhenUsed="1"/>
+    <w:lsdException w:name="HTML Acronym" w:semiHidden="1" w:unhideWhenUsed="1"/>
+    <w:lsdException w:name="HTML Address" w:semiHidden="1" w:unhideWhenUsed="1"/>
+    <w:lsdException w:name="HTML Cite" w:semiHidden="1" w:unhideWhenUsed="1"/>
+    <w:lsdException w:name="HTML Code" w:semiHidden="1" w:unhideWhenUsed="1"/>
+    <w:lsdException w:name="HTML Definition" w:semiHidden="1" w:unhideWhenUsed="1"/>
+    <w:lsdException w:name="HTML Keyboard" w:semiHidden="1" w:unhideWhenUsed="1"/>
+    <w:lsdException w:name="HTML Preformatted" w:semiHidden="1" w:unhideWhenUsed="1"/>
+    <w:lsdException w:name="HTML Sample" w:semiHidden="1" w:unhideWhenUsed="1"/>
+    <w:lsdException w:name="HTML Typewriter" w:semiHidden="1" w:unhideWhenUsed="1"/>
+    <w:lsdException w:name="HTML Variable" w:semiHidden="1" w:unhideWhenUsed="1"/>
+    <w:lsdException w:name="Normal Table" w:semiHidden="1" w:unhideWhenUsed="1"/>
+    <w:lsdException w:name="annotation subject" w:semiHidden="1" w:unhideWhenUsed="1"/>
+    <w:lsdException w:name="No List" w:semiHidden="1" w:unhideWhenUsed="1"/>
+    <w:lsdException w:name="Outline List 1" w:semiHidden="1" w:unhideWhenUsed="1"/>
+    <w:lsdException w:name="Outline List 2" w:semiHidden="1" w:unhideWhenUsed="1"/>
+    <w:lsdException w:name="Outline List 3" w:semiHidden="1" w:unhideWhenUsed="1"/>
+    <w:lsdException w:name="Table Simple 1" w:semiHidden="1" w:unhideWhenUsed="1"/>
+    <w:lsdException w:name="Table Simple 2" w:semiHidden="1" w:unhideWhenUsed="1"/>
+    <w:lsdException w:name="Table Simple 3" w:semiHidden="1" w:unhideWhenUsed="1"/>
+    <w:lsdException w:name="Table Classic 1" w:semiHidden="1" w:unhideWhenUsed="1"/>
+    <w:lsdException w:name="Table Classic 2" w:semiHidden="1" w:unhideWhenUsed="1"/>
+    <w:lsdException w:name="Table Classic 3" w:semiHidden="1" w:unhideWhenUsed="1"/>
+    <w:lsdException w:name="Table Classic 4" w:semiHidden="1" w:unhideWhenUsed="1"/>
+    <w:lsdException w:name="Table Colorful 1" w:semiHidden="1" w:unhideWhenUsed="1"/>
+    <w:lsdException w:name="Table Colorful 2" w:semiHidden="1" w:unhideWhenUsed="1"/>
+    <w:lsdException w:name="Table Colorful 3" w:semiHidden="1" w:unhideWhenUsed="1"/>
+    <w:lsdException w:name="Table Columns 1" w:semiHidden="1" w:unhideWhenUsed="1"/>
+    <w:lsdException w:name="Table Columns 2" w:semiHidden="1" w:unhideWhenUsed="1"/>
+    <w:lsdException w:name="Table Columns 3" w:semiHidden="1" w:unhideWhenUsed="1"/>
+    <w:lsdException w:name="Table Columns 4" w:semiHidden="1" w:unhideWhenUsed="1"/>
+    <w:lsdException w:name="Table Columns 5" w:semiHidden="1" w:unhideWhenUsed="1"/>
+    <w:lsdException w:name="Table Grid 1" w:semiHidden="1" w:unhideWhenUsed="1"/>
+    <w:lsdException w:name="Table Grid 2" w:semiHidden="1" w:unhideWhenUsed="1"/>
+    <w:lsdException w:name="Table Grid 3" w:semiHidden="1" w:unhideWhenUsed="1"/>
+    <w:lsdException w:name="Table Grid 4" w:semiHidden="1" w:unhideWhenUsed="1"/>
+    <w:lsdException w:name="Table Grid 5" w:semiHidden="1" w:unhideWhenUsed="1"/>
+    <w:lsdException w:name="Table Grid 6" w:semiHidden="1" w:unhideWhenUsed="1"/>
+    <w:lsdException w:name="Table Grid 7" w:semiHidden="1" w:unhideWhenUsed="1"/>
+    <w:lsdException w:name="Table Grid 8" w:semiHidden="1" w:unhideWhenUsed="1"/>
+    <w:lsdException w:name="Table List 1" w:semiHidden="1" w:unhideWhenUsed="1"/>
+    <w:lsdException w:name="Table List 2" w:semiHidden="1" w:unhideWhenUsed="1"/>
+    <w:lsdException w:name="Table List 3" w:semiHidden="1" w:unhideWhenUsed="1"/>
+    <w:lsdException w:name="Table List 4" w:semiHidden="1" w:unhideWhenUsed="1"/>
+    <w:lsdException w:name="Table List 5" w:semiHidden="1" w:unhideWhenUsed="1"/>
+    <w:lsdException w:name="Table List 6" w:semiHidden="1" w:unhideWhenUsed="1"/>
+    <w:lsdException w:name="Table List 7" w:semiHidden="1" w:unhideWhenUsed="1"/>
+    <w:lsdException w:name="Table List 8" w:semiHidden="1" w:unhideWhenUsed="1"/>
+    <w:lsdException w:name="Table 3D effects 1" w:semiHidden="1" w:unhideWhenUsed="1"/>
+    <w:lsdException w:name="Table 3D effects 2" w:semiHidden="1" w:unhideWhenUsed="1"/>
+    <w:lsdException w:name="Table 3D effects 3" w:semiHidden="1" w:unhideWhenUsed="1"/>
+    <w:lsdException w:name="Table Contemporary" w:semiHidden="1" w:unhideWhenUsed="1"/>
+    <w:lsdException w:name="Table Elegant" w:semiHidden="1" w:unhideWhenUsed="1"/>
+    <w:lsdException w:name="Table Professional" w:semiHidden="1" w:unhideWhenUsed="1"/>
+    <w:lsdException w:name="Table Subtle 1" w:semiHidden="1" w:unhideWhenUsed="1"/>
+    <w:lsdException w:name="Table Subtle 2" w:semiHidden="1" w:unhideWhenUsed="1"/>
+    <w:lsdException w:name="Table Web 1" w:semiHidden="1" w:unhideWhenUsed="1"/>
+    <w:lsdException w:name="Table Web 2" w:semiHidden="1" w:unhideWhenUsed="1"/>
+    <w:lsdException w:name="Table Web 3" w:semiHidden="1" w:unhideWhenUsed="1"/>
+    <w:lsdException w:name="Balloon Text" w:semiHidden="1" w:unhideWhenUsed="1"/>
+    <w:lsdException w:name="Table Grid" w:uiPriority="39"/>
+    <w:lsdException w:name="Table Theme" w:semiHidden="1" w:unhideWhenUsed="1"/>
+    <w:lsdException w:name="Placeholder Text" w:semiHidden="1"/>
+    <w:lsdException w:name="No Spacing" w:uiPriority="1" w:qFormat="1"/>
+    <w:lsdException w:name="Light Shading" w:uiPriority="60"/>
+    <w:lsdException w:name="Light List" w:uiPriority="61"/>
+    <w:lsdException w:name="Light Grid" w:uiPriority="62"/>
+    <w:lsdException w:name="Medium Shading 1" w:uiPriority="63"/>
+    <w:lsdException w:name="Medium Shading 2" w:uiPriority="64"/>
+    <w:lsdException w:name="Medium List 1" w:uiPriority="65"/>
+    <w:lsdException w:name="Medium List 2" w:uiPriority="66"/>
+    <w:lsdException w:name="Medium Grid 1" w:uiPriority="67"/>
+    <w:lsdException w:name="Medium Grid 2" w:uiPriority="68"/>
+    <w:lsdException w:name="Medium Grid 3" w:uiPriority="69"/>
+    <w:lsdException w:name="Dark List" w:uiPriority="70"/>
+    <w:lsdException w:name="Colorful Shading" w:uiPriority="71"/>
+    <w:lsdException w:name="Colorful List" w:uiPriority="72"/>
+    <w:lsdException w:name="Colorful Grid" w:uiPriority="73"/>
+    <w:lsdException w:name="Light Shading Accent 1" w:uiPriority="60"/>
+    <w:lsdException w:name="Light List Accent 1" w:uiPriority="61"/>
+    <w:lsdException w:name="Light Grid Accent 1" w:uiPriority="62"/>
+    <w:lsdException w:name="Medium Shading 1 Accent 1" w:uiPriority="63"/>
+    <w:lsdException w:name="Medium Shading 2 Accent 1" w:uiPriority="64"/>
+    <w:lsdException w:name="Medium List 1 Accent 1" w:uiPriority="65"/>
+    <w:lsdException w:name="Revision" w:semiHidden="1"/>
+    <w:lsdException w:name="List Paragraph" w:uiPriority="34" w:qFormat="1"/>
+    <w:lsdException w:name="Quote" w:uiPriority="29" w:qFormat="1"/>
+    <w:lsdException w:name="Intense Quote" w:uiPriority="30" w:qFormat="1"/>
+    <w:lsdException w:name="Medium List 2 Accent 1" w:uiPriority="66"/>
+    <w:lsdException w:name="Medium Grid 1 Accent 1" w:uiPriority="67"/>
+    <w:lsdException w:name="Medium Grid 2 Accent 1" w:uiPriority="68"/>
+    <w:lsdException w:name="Medium Grid 3 Accent 1" w:uiPriority="69"/>
+    <w:lsdException w:name="Dark List Accent 1" w:uiPriority="70"/>
+    <w:lsdException w:name="Colorful Shading Accent 1" w:uiPriority="71"/>
+    <w:lsdException w:name="Colorful List Accent 1" w:uiPriority="72"/>
+    <w:lsdException w:name="Colorful Grid Accent 1" w:uiPriority="73"/>
+    <w:lsdException w:name="Light Shading Accent 2" w:uiPriority="60"/>
+    <w:lsdException w:name="Light List Accent 2" w:uiPriority="61"/>
+    <w:lsdException w:name="Light Grid Accent 2" w:uiPriority="62"/>
+    <w:lsdException w:name="Medium Shading 1 Accent 2" w:uiPriority="63"/>
+    <w:lsdException w:name="Medium Shading 2 Accent 2" w:uiPriority="64"/>
+    <w:lsdException w:name="Medium List 1 Accent 2" w:uiPriority="65"/>
+    <w:lsdException w:name="Medium List 2 Accent 2" w:uiPriority="66"/>
+    <w:lsdException w:name="Medium Grid 1 Accent 2" w:uiPriority="67"/>
+    <w:lsdException w:name="Medium Grid 2 Accent 2" w:uiPriority="68"/>
+    <w:lsdException w:name="Medium Grid 3 Accent 2" w:uiPriority="69"/>
+    <w:lsdException w:name="Dark List Accent 2" w:uiPriority="70"/>
+    <w:lsdException w:name="Colorful Shading Accent 2" w:uiPriority="71"/>
+    <w:lsdException w:name="Colorful List Accent 2" w:uiPriority="72"/>
+    <w:lsdException w:name="Colorful Grid Accent 2" w:uiPriority="73"/>
+    <w:lsdException w:name="Light Shading Accent 3" w:uiPriority="60"/>
+    <w:lsdException w:name="Light List Accent 3" w:uiPriority="61"/>
+    <w:lsdException w:name="Light Grid Accent 3" w:uiPriority="62"/>
+    <w:lsdException w:name="Medium Shading 1 Accent 3" w:uiPriority="63"/>
+    <w:lsdException w:name="Medium Shading 2 Accent 3" w:uiPriority="64"/>
+    <w:lsdException w:name="Medium List 1 Accent 3" w:uiPriority="65"/>
+    <w:lsdException w:name="Medium List 2 Accent 3" w:uiPriority="66"/>
+    <w:lsdException w:name="Medium Grid 1 Accent 3" w:uiPriority="67"/>
+    <w:lsdException w:name="Medium Grid 2 Accent 3" w:uiPriority="68"/>
+    <w:lsdException w:name="Medium Grid 3 Accent 3" w:uiPriority="69"/>
+    <w:lsdException w:name="Dark List Accent 3" w:uiPriority="70"/>
+    <w:lsdException w:name="Colorful Shading Accent 3" w:uiPriority="71"/>
+    <w:lsdException w:name="Colorful List Accent 3" w:uiPriority="72"/>
+    <w:lsdException w:name="Colorful Grid Accent 3" w:uiPriority="73"/>
+    <w:lsdException w:name="Light Shading Accent 4" w:uiPriority="60"/>
+    <w:lsdException w:name="Light List Accent 4" w:uiPriority="61"/>
+    <w:lsdException w:name="Light Grid Accent 4" w:uiPriority="62"/>
+    <w:lsdException w:name="Medium Shading 1 Accent 4" w:uiPriority="63"/>
+    <w:lsdException w:name="Medium Shading 2 Accent 4" w:uiPriority="64"/>
+    <w:lsdException w:name="Medium List 1 Accent 4" w:uiPriority="65"/>
+    <w:lsdException w:name="Medium List 2 Accent 4" w:uiPriority="66"/>
+    <w:lsdException w:name="Medium Grid 1 Accent 4" w:uiPriority="67"/>
+    <w:lsdException w:name="Medium Grid 2 Accent 4" w:uiPriority="68"/>
+    <w:lsdException w:name="Medium Grid 3 Accent 4" w:uiPriority="69"/>
+    <w:lsdException w:name="Dark List Accent 4" w:uiPriority="70"/>
+    <w:lsdException w:name="Colorful Shading Accent 4" w:uiPriority="71"/>
+    <w:lsdException w:name="Colorful List Accent 4" w:uiPriority="72"/>
+    <w:lsdException w:name="Colorful Grid Accent 4" w:uiPriority="73"/>
+    <w:lsdException w:name="Light Shading Accent 5" w:uiPriority="60"/>
+    <w:lsdException w:name="Light List Accent 5" w:uiPriority="61"/>
+    <w:lsdException w:name="Light Grid Accent 5" w:uiPriority="62"/>
+    <w:lsdException w:name="Medium Shading 1 Accent 5" w:uiPriority="63"/>
+    <w:lsdException w:name="Medium Shading 2 Accent 5" w:uiPriority="64"/>
+    <w:lsdException w:name="Medium List 1 Accent 5" w:uiPriority="65"/>
+    <w:lsdException w:name="Medium List 2 Accent 5" w:uiPriority="66"/>
+    <w:lsdException w:name="Medium Grid 1 Accent 5" w:uiPriority="67"/>
+    <w:lsdException w:name="Medium Grid 2 Accent 5" w:uiPriority="68"/>
+    <w:lsdException w:name="Medium Grid 3 Accent 5" w:uiPriority="69"/>
+    <w:lsdException w:name="Dark List Accent 5" w:uiPriority="70"/>
+    <w:lsdException w:name="Colorful Shading Accent 5" w:uiPriority="71"/>
+    <w:lsdException w:name="Colorful List Accent 5" w:uiPriority="72"/>
+    <w:lsdException w:name="Colorful Grid Accent 5" w:uiPriority="73"/>
+    <w:lsdException w:name="Light Shading Accent 6" w:uiPriority="60"/>
+    <w:lsdException w:name="Light List Accent 6" w:uiPriority="61"/>
+    <w:lsdException w:name="Light Grid Accent 6" w:uiPriority="62"/>
+    <w:lsdException w:name="Medium Shading 1 Accent 6" w:uiPriority="63"/>
+    <w:lsdException w:name="Medium Shading 2 Accent 6" w:uiPriority="64"/>
+    <w:lsdException w:name="Medium List 1 Accent 6" w:uiPriority="65"/>
+    <w:lsdException w:name="Medium List 2 Accent 6" w:uiPriority="66"/>
+    <w:lsdException w:name="Medium Grid 1 Accent 6" w:uiPriority="67"/>
+    <w:lsdException w:name="Medium Grid 2 Accent 6" w:uiPriority="68"/>
+    <w:lsdException w:name="Medium Grid 3 Accent 6" w:uiPriority="69"/>
+    <w:lsdException w:name="Dark List Accent 6" w:uiPriority="70"/>
+    <w:lsdException w:name="Colorful Shading Accent 6" w:uiPriority="71"/>
+    <w:lsdException w:name="Colorful List Accent 6" w:uiPriority="72"/>
+    <w:lsdException w:name="Colorful Grid Accent 6" w:uiPriority="73"/>
+    <w:lsdException w:name="Subtle Emphasis" w:uiPriority="19" w:qFormat="1"/>
+    <w:lsdException w:name="Intense Emphasis" w:uiPriority="21" w:qFormat="1"/>
+    <w:lsdException w:name="Subtle Reference" w:uiPriority="31" w:qFormat="1"/>
+    <w:lsdException w:name="Intense Reference" w:uiPriority="32" w:qFormat="1"/>
+    <w:lsdException w:name="Book Title" w:uiPriority="33" w:qFormat="1"/>
+    <w:lsdException w:name="Bibliography" w:semiHidden="1" w:uiPriority="37" w:unhideWhenUsed="1"/>
+    <w:lsdException w:name="TOC Heading" w:semiHidden="1" w:uiPriority="39" w:unhideWhenUsed="1" w:qFormat="1"/>
+    <w:lsdException w:name="Plain Table 1" w:uiPriority="41"/>
+    <w:lsdException w:name="Plain Table 2" w:uiPriority="42"/>
+    <w:lsdException w:name="Plain Table 3" w:uiPriority="43"/>
+    <w:lsdException w:name="Plain Table 4" w:uiPriority="44"/>
+    <w:lsdException w:name="Plain Table 5" w:uiPriority="45"/>
+    <w:lsdException w:name="Grid Table Light" w:uiPriority="40"/>
+    <w:lsdException w:name="Grid Table 1 Light" w:uiPriority="46"/>
+    <w:lsdException w:name="Grid Table 2" w:uiPriority="47"/>
+    <w:lsdException w:name="Grid Table 3" w:uiPriority="48"/>
+    <w:lsdException w:name="Grid Table 4" w:uiPriority="49"/>
+    <w:lsdException w:name="Grid Table 5 Dark" w:uiPriority="50"/>
+    <w:lsdException w:name="Grid Table 6 Colorful" w:uiPriority="51"/>
+    <w:lsdException w:name="Grid Table 7 Colorful" w:uiPriority="52"/>
+    <w:lsdException w:name="Grid Table 1 Light Accent 1" w:uiPriority="46"/>
+    <w:lsdException w:name="Grid Table 2 Accent 1" w:uiPriority="47"/>
+    <w:lsdException w:name="Grid Table 3 Accent 1" w:uiPriority="48"/>
+    <w:lsdException w:name="Grid Table 4 Accent 1" w:uiPriority="49"/>
+    <w:lsdException w:name="Grid Table 5 Dark Accent 1" w:uiPriority="50"/>
+    <w:lsdException w:name="Grid Table 6 Colorful Accent 1" w:uiPriority="51"/>
+    <w:lsdException w:name="Grid Table 7 Colorful Accent 1" w:uiPriority="52"/>
+    <w:lsdException w:name="Grid Table 1 Light Accent 2" w:uiPriority="46"/>
+    <w:lsdException w:name="Grid Table 2 Accent 2" w:uiPriority="47"/>
+    <w:lsdException w:name="Grid Table 3 Accent 2" w:uiPriority="48"/>
+    <w:lsdException w:name="Grid Table 4 Accent 2" w:uiPriority="49"/>
+    <w:lsdException w:name="Grid Table 5 Dark Accent 2" w:uiPriority="50"/>
+    <w:lsdException w:name="Grid Table 6 Colorful Accent 2" w:uiPriority="51"/>
+    <w:lsdException w:name="Grid Table 7 Colorful Accent 2" w:uiPriority="52"/>
+    <w:lsdException w:name="Grid Table 1 Light Accent 3" w:uiPriority="46"/>
+    <w:lsdException w:name="Grid Table 2 Accent 3" w:uiPriority="47"/>
+    <w:lsdException w:name="Grid Table 3 Accent 3" w:uiPriority="48"/>
+    <w:lsdException w:name="Grid Table 4 Accent 3" w:uiPriority="49"/>
+    <w:lsdException w:name="Grid Table 5 Dark Accent 3" w:uiPriority="50"/>
+    <w:lsdException w:name="Grid Table 6 Colorful Accent 3" w:uiPriority="51"/>
+    <w:lsdException w:name="Grid Table 7 Colorful Accent 3" w:uiPriority="52"/>
+    <w:lsdException w:name="Grid Table 1 Light Accent 4" w:uiPriority="46"/>
+    <w:lsdException w:name="Grid Table 2 Accent 4" w:uiPriority="47"/>
+    <w:lsdException w:name="Grid Table 3 Accent 4" w:uiPriority="48"/>
+    <w:lsdException w:name="Grid Table 4 Accent 4" w:uiPriority="49"/>
+    <w:lsdException w:name="Grid Table 5 Dark Accent 4" w:uiPriority="50"/>
+    <w:lsdException w:name="Grid Table 6 Colorful Accent 4" w:uiPriority="51"/>
+    <w:lsdException w:name="Grid Table 7 Colorful Accent 4" w:uiPriority="52"/>
+    <w:lsdException w:name="Grid Table 1 Light Accent 5" w:uiPriority="46"/>
+    <w:lsdException w:name="Grid Table 2 Accent 5" w:uiPriority="47"/>
+    <w:lsdException w:name="Grid Table 3 Accent 5" w:uiPriority="48"/>
+    <w:lsdException w:name="Grid Table 4 Accent 5" w:uiPriority="49"/>
+    <w:lsdException w:name="Grid Table 5 Dark Accent 5" w:uiPriority="50"/>
+    <w:lsdException w:name="Grid Table 6 Colorful Accent 5" w:uiPriority="51"/>
+    <w:lsdException w:name="Grid Table 7 Colorful Accent 5" w:uiPriority="52"/>
+    <w:lsdException w:name="Grid Table 1 Light Accent 6" w:uiPriority="46"/>
+    <w:lsdException w:name="Grid Table 2 Accent 6" w:uiPriority="47"/>
+    <w:lsdException w:name="Grid Table 3 Accent 6" w:uiPriority="48"/>
+    <w:lsdException w:name="Grid Table 4 Accent 6" w:uiPriority="49"/>
+    <w:lsdException w:name="Grid Table 5 Dark Accent 6" w:uiPriority="50"/>
+    <w:lsdException w:name="Grid Table 6 Colorful Accent 6" w:uiPriority="51"/>
+    <w:lsdException w:name="Grid Table 7 Colorful Accent 6" w:uiPriority="52"/>
+    <w:lsdException w:name="List Table 1 Light" w:uiPriority="46"/>
+    <w:lsdException w:name="List Table 2" w:uiPriority="47"/>
+    <w:lsdException w:name="List Table 3" w:uiPriority="48"/>
+    <w:lsdException w:name="List Table 4" w:uiPriority="49"/>
+    <w:lsdException w:name="List Table 5 Dark" w:uiPriority="50"/>
+    <w:lsdException w:name="List Table 6 Colorful" w:uiPriority="51"/>
+    <w:lsdException w:name="List Table 7 Colorful" w:uiPriority="52"/>
+    <w:lsdException w:name="List Table 1 Light Accent 1" w:uiPriority="46"/>
+    <w:lsdException w:name="List Table 2 Accent 1" w:uiPriority="47"/>
+    <w:lsdException w:name="List Table 3 Accent 1" w:uiPriority="48"/>
+    <w:lsdException w:name="List Table 4 Accent 1" w:uiPriority="49"/>
+    <w:lsdException w:name="List Table 5 Dark Accent 1" w:uiPriority="50"/>
+    <w:lsdException w:name="List Table 6 Colorful Accent 1" w:uiPriority="51"/>
+    <w:lsdException w:name="List Table 7 Colorful Accent 1" w:uiPriority="52"/>
+    <w:lsdException w:name="List Table 1 Light Accent 2" w:uiPriority="46"/>
+    <w:lsdException w:name="List Table 2 Accent 2" w:uiPriority="47"/>
+    <w:lsdException w:name="List Table 3 Accent 2" w:uiPriority="48"/>
+    <w:lsdException w:name="List Table 4 Accent 2" w:uiPriority="49"/>
+    <w:lsdException w:name="List Table 5 Dark Accent 2" w:uiPriority="50"/>
+    <w:lsdException w:name="List Table 6 Colorful Accent 2" w:uiPriority="51"/>
+    <w:lsdException w:name="List Table 7 Colorful Accent 2" w:uiPriority="52"/>
+    <w:lsdException w:name="List Table 1 Light Accent 3" w:uiPriority="46"/>
+    <w:lsdException w:name="List Table 2 Accent 3" w:uiPriority="47"/>
+    <w:lsdException w:name="List Table 3 Accent 3" w:uiPriority="48"/>
+    <w:lsdException w:name="List Table 4 Accent 3" w:uiPriority="49"/>
+    <w:lsdException w:name="List Table 5 Dark Accent 3" w:uiPriority="50"/>
+    <w:lsdException w:name="List Table 6 Colorful Accent 3" w:uiPriority="51"/>
+    <w:lsdException w:name="List Table 7 Colorful Accent 3" w:uiPriority="52"/>
+    <w:lsdException w:name="List Table 1 Light Accent 4" w:uiPriority="46"/>
+    <w:lsdException w:name="List Table 2 Accent 4" w:uiPriority="47"/>
+    <w:lsdException w:name="List Table 3 Accent 4" w:uiPriority="48"/>
+    <w:lsdException w:name="List Table 4 Accent 4" w:uiPriority="49"/>
+    <w:lsdException w:name="List Table 5 Dark Accent 4" w:uiPriority="50"/>
+    <w:lsdException w:name="List Table 6 Colorful Accent 4" w:uiPriority="51"/>
+    <w:lsdException w:name="List Table 7 Colorful Accent 4" w:uiPriority="52"/>
+    <w:lsdException w:name="List Table 1 Light Accent 5" w:uiPriority="46"/>
+    <w:lsdException w:name="List Table 2 Accent 5" w:uiPriority="47"/>
+    <w:lsdException w:name="List Table 3 Accent 5" w:uiPriority="48"/>
+    <w:lsdException w:name="List Table 4 Accent 5" w:uiPriority="49"/>
+    <w:lsdException w:name="List Table 5 Dark Accent 5" w:uiPriority="50"/>
+    <w:lsdException w:name="List Table 6 Colorful Accent 5" w:uiPriority="51"/>
+    <w:lsdException w:name="List Table 7 Colorful Accent 5" w:uiPriority="52"/>
+    <w:lsdException w:name="List Table 1 Light Accent 6" w:uiPriority="46"/>
+    <w:lsdException w:name="List Table 2 Accent 6" w:uiPriority="47"/>
+    <w:lsdException w:name="List Table 3 Accent 6" w:uiPriority="48"/>
+    <w:lsdException w:name="List Table 4 Accent 6" w:uiPriority="49"/>
+    <w:lsdException w:name="List Table 5 Dark Accent 6" w:uiPriority="50"/>
+    <w:lsdException w:name="List Table 6 Colorful Accent 6" w:uiPriority="51"/>
+    <w:lsdException w:name="List Table 7 Colorful Accent 6" w:uiPriority="52"/>
+    <w:lsdException w:name="Mention" w:semiHidden="1" w:unhideWhenUsed="1"/>
+    <w:lsdException w:name="Smart Hyperlink" w:semiHidden="1" w:unhideWhenUsed="1"/>
+    <w:lsdException w:name="Hashtag" w:semiHidden="1" w:unhideWhenUsed="1"/>
+    <w:lsdException w:name="Unresolved Mention" w:semiHidden="1" w:unhideWhenUsed="1"/>
+    <w:lsdException w:name="Smart Link" w:semiHidden="1" w:unhideWhenUsed="1"/>
+  </w:latentStyles>
+  <w:style w:type="paragraph" w:default="1" w:styleId="Normal">
     <w:name w:val="Normal"/>
     <w:qFormat/>
-    <w:pPr>
-      <w:widowControl/>
-      <w:bidi w:val="0"/>
-    </w:pPr>
-    <w:rPr>
-      <w:rFonts w:ascii="Liberation Serif" w:hAnsi="Liberation Serif" w:eastAsia="NSimSun" w:cs="Lucida Sans"/>
-      <w:color w:val="auto"/>
-      <w:kern w:val="2"/>
-      <w:sz w:val="24"/>
-      <w:szCs w:val="24"/>
-      <w:lang w:val="es-CL" w:eastAsia="zh-CN" w:bidi="hi-IN"/>
-    </w:rPr>
   </w:style>
-  <w:style w:type="paragraph" w:styleId="Heading2">
-    <w:name w:val="Heading 2"/>
+  <w:style w:type="paragraph" w:styleId="Ttulo2">
+    <w:name w:val="heading 2"/>
     <w:basedOn w:val="Ttulo"/>
-    <w:next w:val="BodyText"/>
+    <w:next w:val="Textoindependiente"/>
+    <w:uiPriority w:val="9"/>
+    <w:unhideWhenUsed/>
     <w:qFormat/>
     <w:pPr>
-      <w:spacing w:before="200" w:after="120"/>
+      <w:spacing w:before="200"/>
       <w:outlineLvl w:val="1"/>
     </w:pPr>
     <w:rPr>
-      <w:rFonts w:ascii="Liberation Serif" w:hAnsi="Liberation Serif" w:eastAsia="NSimSun" w:cs="Lucida Sans"/>
+      <w:rFonts w:ascii="Liberation Serif" w:eastAsia="NSimSun" w:hAnsi="Liberation Serif"/>
       <w:b/>
       <w:bCs/>
       <w:sz w:val="36"/>
       <w:szCs w:val="36"/>
     </w:rPr>
   </w:style>
-  <w:style w:type="paragraph" w:styleId="Heading3">
-    <w:name w:val="Heading 3"/>
+  <w:style w:type="paragraph" w:styleId="Ttulo3">
+    <w:name w:val="heading 3"/>
     <w:basedOn w:val="Ttulo"/>
-    <w:next w:val="BodyText"/>
+    <w:next w:val="Textoindependiente"/>
+    <w:uiPriority w:val="9"/>
+    <w:unhideWhenUsed/>
     <w:qFormat/>
     <w:pPr>
-      <w:spacing w:before="140" w:after="120"/>
+      <w:spacing w:before="140"/>
       <w:outlineLvl w:val="2"/>
     </w:pPr>
     <w:rPr>
-      <w:rFonts w:ascii="Liberation Serif" w:hAnsi="Liberation Serif" w:eastAsia="NSimSun" w:cs="Lucida Sans"/>
+      <w:rFonts w:ascii="Liberation Serif" w:eastAsia="NSimSun" w:hAnsi="Liberation Serif"/>
       <w:b/>
       <w:bCs/>
-      <w:sz w:val="28"/>
-      <w:szCs w:val="28"/>
     </w:rPr>
   </w:style>
-  <w:style w:type="character" w:styleId="Bolos">
+  <w:style w:type="character" w:default="1" w:styleId="Fuentedeprrafopredeter">
+    <w:name w:val="Default Paragraph Font"/>
+    <w:uiPriority w:val="1"/>
+    <w:semiHidden/>
+    <w:unhideWhenUsed/>
+  </w:style>
+  <w:style w:type="table" w:default="1" w:styleId="Tablanormal">
+    <w:name w:val="Normal Table"/>
+    <w:uiPriority w:val="99"/>
+    <w:semiHidden/>
+    <w:unhideWhenUsed/>
+    <w:tblPr>
+      <w:tblInd w:w="0" w:type="dxa"/>
+      <w:tblCellMar>
+        <w:top w:w="0" w:type="dxa"/>
+        <w:left w:w="108" w:type="dxa"/>
+        <w:bottom w:w="0" w:type="dxa"/>
+        <w:right w:w="108" w:type="dxa"/>
+      </w:tblCellMar>
+    </w:tblPr>
+  </w:style>
+  <w:style w:type="numbering" w:default="1" w:styleId="Sinlista">
+    <w:name w:val="No List"/>
+    <w:uiPriority w:val="99"/>
+    <w:semiHidden/>
+    <w:unhideWhenUsed/>
+  </w:style>
+  <w:style w:type="character" w:customStyle="1" w:styleId="Bolos">
     <w:name w:val="Bolos"/>
     <w:qFormat/>
     <w:rPr>
-      <w:rFonts w:ascii="OpenSymbol" w:hAnsi="OpenSymbol" w:eastAsia="OpenSymbol" w:cs="OpenSymbol"/>
+      <w:rFonts w:ascii="OpenSymbol" w:eastAsia="OpenSymbol" w:hAnsi="OpenSymbol" w:cs="OpenSymbol"/>
     </w:rPr>
   </w:style>
-  <w:style w:type="character" w:styleId="Smbolosdenumeracin">
+  <w:style w:type="character" w:customStyle="1" w:styleId="Smbolosdenumeracin">
     <w:name w:val="Símbolos de numeración"/>
     <w:qFormat/>
-    <w:rPr/>
   </w:style>
-  <w:style w:type="character" w:styleId="Textooriginal">
+  <w:style w:type="character" w:customStyle="1" w:styleId="Textooriginal">
     <w:name w:val="Texto original"/>
     <w:qFormat/>
     <w:rPr>
-      <w:rFonts w:ascii="Liberation Mono" w:hAnsi="Liberation Mono" w:eastAsia="NSimSun" w:cs="Liberation Mono"/>
+      <w:rFonts w:ascii="Liberation Mono" w:eastAsia="NSimSun" w:hAnsi="Liberation Mono" w:cs="Liberation Mono"/>
     </w:rPr>
   </w:style>
-  <w:style w:type="character" w:styleId="Strong">
+  <w:style w:type="character" w:styleId="Fuerte">
     <w:name w:val="Strong"/>
     <w:qFormat/>
     <w:rPr>
@@ -2512,38 +2955,34 @@
     </w:rPr>
   </w:style>
   <w:style w:type="paragraph" w:styleId="Ttulo">
-    <w:name w:val="Título"/>
+    <w:name w:val="Title"/>
     <w:basedOn w:val="Normal"/>
-    <w:next w:val="BodyText"/>
+    <w:next w:val="Textoindependiente"/>
+    <w:uiPriority w:val="10"/>
     <w:qFormat/>
     <w:pPr>
-      <w:keepNext w:val="true"/>
+      <w:keepNext/>
       <w:spacing w:before="240" w:after="120"/>
     </w:pPr>
     <w:rPr>
-      <w:rFonts w:ascii="Liberation Sans" w:hAnsi="Liberation Sans" w:eastAsia="Microsoft YaHei" w:cs="Lucida Sans"/>
+      <w:rFonts w:ascii="Liberation Sans" w:eastAsia="Microsoft YaHei" w:hAnsi="Liberation Sans"/>
       <w:sz w:val="28"/>
       <w:szCs w:val="28"/>
     </w:rPr>
   </w:style>
-  <w:style w:type="paragraph" w:styleId="BodyText">
+  <w:style w:type="paragraph" w:styleId="Textoindependiente">
     <w:name w:val="Body Text"/>
     <w:basedOn w:val="Normal"/>
     <w:pPr>
-      <w:spacing w:lineRule="auto" w:line="276" w:before="0" w:after="140"/>
+      <w:spacing w:after="140" w:line="276" w:lineRule="auto"/>
     </w:pPr>
-    <w:rPr/>
   </w:style>
-  <w:style w:type="paragraph" w:styleId="List">
+  <w:style w:type="paragraph" w:styleId="Lista">
     <w:name w:val="List"/>
-    <w:basedOn w:val="BodyText"/>
-    <w:pPr/>
-    <w:rPr>
-      <w:rFonts w:cs="Lucida Sans"/>
-    </w:rPr>
+    <w:basedOn w:val="Textoindependiente"/>
   </w:style>
-  <w:style w:type="paragraph" w:styleId="Caption">
-    <w:name w:val="Caption"/>
+  <w:style w:type="paragraph" w:styleId="Descripcin">
+    <w:name w:val="caption"/>
     <w:basedOn w:val="Normal"/>
     <w:qFormat/>
     <w:pPr>
@@ -2551,40 +2990,32 @@
       <w:spacing w:before="120" w:after="120"/>
     </w:pPr>
     <w:rPr>
-      <w:rFonts w:cs="Lucida Sans"/>
       <w:i/>
       <w:iCs/>
-      <w:sz w:val="24"/>
-      <w:szCs w:val="24"/>
     </w:rPr>
   </w:style>
-  <w:style w:type="paragraph" w:styleId="Ndice">
+  <w:style w:type="paragraph" w:customStyle="1" w:styleId="ndice">
     <w:name w:val="Índice"/>
     <w:basedOn w:val="Normal"/>
     <w:qFormat/>
     <w:pPr>
       <w:suppressLineNumbers/>
     </w:pPr>
-    <w:rPr>
-      <w:rFonts w:cs="Lucida Sans"/>
-    </w:rPr>
   </w:style>
-  <w:style w:type="paragraph" w:styleId="Contenidodelatabla">
+  <w:style w:type="paragraph" w:customStyle="1" w:styleId="Contenidodelatabla">
     <w:name w:val="Contenido de la tabla"/>
     <w:basedOn w:val="Normal"/>
     <w:qFormat/>
     <w:pPr>
-      <w:widowControl w:val="false"/>
+      <w:widowControl w:val="0"/>
       <w:suppressLineNumbers/>
     </w:pPr>
-    <w:rPr/>
   </w:style>
-  <w:style w:type="paragraph" w:styleId="Ttulodelatabla">
+  <w:style w:type="paragraph" w:customStyle="1" w:styleId="Ttulodelatabla">
     <w:name w:val="Título de la tabla"/>
     <w:basedOn w:val="Contenidodelatabla"/>
     <w:qFormat/>
     <w:pPr>
-      <w:suppressLineNumbers/>
       <w:jc w:val="center"/>
     </w:pPr>
     <w:rPr>
@@ -2596,56 +3027,56 @@
 </file>
 
 <file path=word/theme/theme1.xml><?xml version="1.0" encoding="utf-8"?>
-<a:theme xmlns:a="http://schemas.openxmlformats.org/drawingml/2006/main" xmlns:r="http://schemas.openxmlformats.org/officeDocument/2006/relationships" name="Office">
+<a:theme xmlns:a="http://schemas.openxmlformats.org/drawingml/2006/main" name="Office">
   <a:themeElements>
     <a:clrScheme name="LibreOffice">
       <a:dk1>
         <a:srgbClr val="000000"/>
       </a:dk1>
       <a:lt1>
-        <a:srgbClr val="ffffff"/>
+        <a:srgbClr val="FFFFFF"/>
       </a:lt1>
       <a:dk2>
         <a:srgbClr val="000000"/>
       </a:dk2>
       <a:lt2>
-        <a:srgbClr val="ffffff"/>
+        <a:srgbClr val="FFFFFF"/>
       </a:lt2>
       <a:accent1>
-        <a:srgbClr val="18a303"/>
+        <a:srgbClr val="18A303"/>
       </a:accent1>
       <a:accent2>
-        <a:srgbClr val="0369a3"/>
+        <a:srgbClr val="0369A3"/>
       </a:accent2>
       <a:accent3>
-        <a:srgbClr val="a33e03"/>
+        <a:srgbClr val="A33E03"/>
       </a:accent3>
       <a:accent4>
-        <a:srgbClr val="8e03a3"/>
+        <a:srgbClr val="8E03A3"/>
       </a:accent4>
       <a:accent5>
-        <a:srgbClr val="c99c00"/>
+        <a:srgbClr val="C99C00"/>
       </a:accent5>
       <a:accent6>
-        <a:srgbClr val="c9211e"/>
+        <a:srgbClr val="C9211E"/>
       </a:accent6>
       <a:hlink>
-        <a:srgbClr val="0000ee"/>
+        <a:srgbClr val="0000EE"/>
       </a:hlink>
       <a:folHlink>
-        <a:srgbClr val="551a8b"/>
+        <a:srgbClr val="551A8B"/>
       </a:folHlink>
     </a:clrScheme>
     <a:fontScheme name="Office">
       <a:majorFont>
-        <a:latin typeface="Arial" pitchFamily="0" charset="1"/>
-        <a:ea typeface="DejaVu Sans" pitchFamily="0" charset="1"/>
-        <a:cs typeface="DejaVu Sans" pitchFamily="0" charset="1"/>
+        <a:latin typeface="Arial"/>
+        <a:ea typeface="DejaVu Sans"/>
+        <a:cs typeface="DejaVu Sans"/>
       </a:majorFont>
       <a:minorFont>
-        <a:latin typeface="Arial" pitchFamily="0" charset="1"/>
-        <a:ea typeface="DejaVu Sans" pitchFamily="0" charset="1"/>
-        <a:cs typeface="DejaVu Sans" pitchFamily="0" charset="1"/>
+        <a:latin typeface="Arial"/>
+        <a:ea typeface="DejaVu Sans"/>
+        <a:cs typeface="DejaVu Sans"/>
       </a:minorFont>
     </a:fontScheme>
     <a:fmtScheme>
@@ -2698,5 +3129,7 @@
       </a:bgFillStyleLst>
     </a:fmtScheme>
   </a:themeElements>
+  <a:objectDefaults/>
+  <a:extraClrSchemeLst/>
 </a:theme>
 </file>
</xml_diff>